<commit_message>
rename: 星译 StarFlow -> 墨译 Moyi; official PP-OCRv6 source
- rename app label, bundleName (com.xuezhaokun.moyi), repo/project to Moyi
- switch OCR model downloads to PaddlePaddle official PP-OCRv6 small ONNX (Apache-2.0)
- keep upstream StarFlow attribution; remove upstream model dependency
- update copyright (薛朝坤), softcopyright application material and docs
- build + launch verified on Mate 90 Pro emulator
</commit_message>
<xml_diff>
--- a/softcopyright/01-软件说明书.docx
+++ b/softcopyright/01-软件说明书.docx
@@ -16,7 +16,7 @@
           <w:b/>
           <w:sz w:val="52"/>
         </w:rPr>
-        <w:t>星译漫画小说智能翻译软件</w:t>
+        <w:t>墨译漫画小说智能翻译软件</w:t>
       </w:r>
     </w:p>
     <w:p>
@@ -74,7 +74,7 @@
           <w:b w:val="0"/>
           <w:sz w:val="22"/>
         </w:rPr>
-        <w:t>著作权人：【申请人名称，待填】</w:t>
+        <w:t>著作权人：薛朝坤</w:t>
       </w:r>
     </w:p>
     <w:p>
@@ -288,7 +288,7 @@
           <w:b w:val="0"/>
           <w:sz w:val="21"/>
         </w:rPr>
-        <w:t>星译漫画小说智能翻译软件是面向 HarmonyOS NEXT 的本地漫画、小说与文本翻译工具。软件支持导入本地漫画图片和 EPUB/TXT 小说，使用本地 OCR 识别漫画文字，结合在线翻译服务或本地 llama.cpp 模型生成译文，并把译文按原文版式覆盖回页面。</w:t>
+        <w:t>墨译漫画小说智能翻译软件是面向 HarmonyOS NEXT 的本地漫画、小说与文本翻译工具。软件支持导入本地漫画图片和 EPUB/TXT 小说，使用本地 OCR 识别漫画文字，结合在线翻译服务或本地 llama.cpp 模型生成译文，并把译文按原文版式覆盖回页面。</w:t>
       </w:r>
     </w:p>
     <w:p>
@@ -429,7 +429,7 @@
           <w:b w:val="0"/>
           <w:sz w:val="21"/>
         </w:rPr>
-        <w:t>通过应用商店或调试安装 HAP 后，桌面出现“星译 StarFlow”图标。首次启动进入书架页，底部为书架、翻译、历史、我的四个入口。</w:t>
+        <w:t>通过应用商店或调试安装 HAP 后，桌面出现“墨译 Moyi”图标。首次启动进入书架页，底部为书架、翻译、历史、我的四个入口。</w:t>
       </w:r>
     </w:p>
     <w:p>
@@ -1636,7 +1636,7 @@
         <w:b w:val="0"/>
         <w:sz w:val="16"/>
       </w:rPr>
-      <w:t>星译漫画小说智能翻译软件 V1.1.0  软件说明书</w:t>
+      <w:t>墨译漫画小说智能翻译软件 V1.1.0  软件说明书</w:t>
     </w:r>
   </w:p>
 </w:hdr>

</xml_diff>

<commit_message>
docs(softcopyright): add submission-ready PDFs and applicant guidance
- export 60-page source PDF and 15-page manual PDF
- two-line header: software/version left, page number top right
- add individual applicant/signature guide and certificate/fee guide
- verify PDF page counts, add SHA-256 and final checklist
- add Apache-2.0 and OFL license texts
</commit_message>
<xml_diff>
--- a/softcopyright/01-软件说明书.docx
+++ b/softcopyright/01-软件说明书.docx
@@ -1577,9 +1577,34 @@
   <w:p>
     <w:pPr>
       <w:pStyle w:val="Footer"/>
-      <w:jc w:val="center"/>
     </w:pPr>
     <w:r/>
+  </w:p>
+</w:ftr>
+</file>
+
+<file path=word/header1.xml><?xml version="1.0" encoding="utf-8"?>
+<w:hdr xmlns:m="http://schemas.openxmlformats.org/officeDocument/2006/math" xmlns:mc="http://schemas.openxmlformats.org/markup-compatibility/2006" xmlns:mo="http://schemas.microsoft.com/office/mac/office/2008/main" xmlns:mv="urn:schemas-microsoft-com:mac:vml" xmlns:o="urn:schemas-microsoft-com:office:office" xmlns:r="http://schemas.openxmlformats.org/officeDocument/2006/relationships" xmlns:v="urn:schemas-microsoft-com:vml" xmlns:w10="urn:schemas-microsoft-com:office:word" xmlns:w14="http://schemas.microsoft.com/office/word/2010/wordml" xmlns:w="http://schemas.openxmlformats.org/wordprocessingml/2006/main" xmlns:wne="http://schemas.microsoft.com/office/word/2006/wordml" xmlns:wp14="http://schemas.microsoft.com/office/word/2010/wordprocessingDrawing" xmlns:wp="http://schemas.openxmlformats.org/drawingml/2006/wordprocessingDrawing" xmlns:wpc="http://schemas.microsoft.com/office/word/2010/wordprocessingCanvas" xmlns:wpg="http://schemas.microsoft.com/office/word/2010/wordprocessingGroup" xmlns:wpi="http://schemas.microsoft.com/office/word/2010/wordprocessingInk" xmlns:wps="http://schemas.microsoft.com/office/word/2010/wordprocessingShape" mc:Ignorable="w14 wp14">
+  <w:p>
+    <w:pPr>
+      <w:pStyle w:val="Header"/>
+      <w:spacing w:after="0"/>
+    </w:pPr>
+    <w:r/>
+    <w:r>
+      <w:rPr>
+        <w:rFonts w:ascii="宋体" w:hAnsi="宋体" w:eastAsia="宋体"/>
+        <w:b w:val="0"/>
+        <w:sz w:val="16"/>
+      </w:rPr>
+      <w:t>墨译漫画小说智能翻译软件 V1.1.0  软件说明书</w:t>
+    </w:r>
+  </w:p>
+  <w:p>
+    <w:pPr>
+      <w:spacing w:after="0"/>
+      <w:jc w:val="right"/>
+    </w:pPr>
     <w:r>
       <w:rPr>
         <w:rFonts w:ascii="宋体" w:hAnsi="宋体" w:eastAsia="宋体"/>
@@ -1601,42 +1626,7 @@
         <w:b w:val="0"/>
         <w:sz w:val="16"/>
       </w:rPr>
-      <w:t xml:space="preserve"> 页 / 共 </w:t>
-    </w:r>
-    <w:r>
-      <w:fldChar w:fldCharType="begin"/>
-      <w:instrText xml:space="preserve">NUMPAGES</w:instrText>
-      <w:fldChar w:fldCharType="separate"/>
-      <w:t>1</w:t>
-      <w:fldChar w:fldCharType="end"/>
-    </w:r>
-    <w:r>
-      <w:rPr>
-        <w:rFonts w:ascii="宋体" w:hAnsi="宋体" w:eastAsia="宋体"/>
-        <w:b w:val="0"/>
-        <w:sz w:val="16"/>
-      </w:rPr>
       <w:t xml:space="preserve"> 页</w:t>
-    </w:r>
-  </w:p>
-</w:ftr>
-</file>
-
-<file path=word/header1.xml><?xml version="1.0" encoding="utf-8"?>
-<w:hdr xmlns:m="http://schemas.openxmlformats.org/officeDocument/2006/math" xmlns:mc="http://schemas.openxmlformats.org/markup-compatibility/2006" xmlns:mo="http://schemas.microsoft.com/office/mac/office/2008/main" xmlns:mv="urn:schemas-microsoft-com:mac:vml" xmlns:o="urn:schemas-microsoft-com:office:office" xmlns:r="http://schemas.openxmlformats.org/officeDocument/2006/relationships" xmlns:v="urn:schemas-microsoft-com:vml" xmlns:w10="urn:schemas-microsoft-com:office:word" xmlns:w14="http://schemas.microsoft.com/office/word/2010/wordml" xmlns:w="http://schemas.openxmlformats.org/wordprocessingml/2006/main" xmlns:wne="http://schemas.microsoft.com/office/word/2006/wordml" xmlns:wp14="http://schemas.microsoft.com/office/word/2010/wordprocessingDrawing" xmlns:wp="http://schemas.openxmlformats.org/drawingml/2006/wordprocessingDrawing" xmlns:wpc="http://schemas.microsoft.com/office/word/2010/wordprocessingCanvas" xmlns:wpg="http://schemas.microsoft.com/office/word/2010/wordprocessingGroup" xmlns:wpi="http://schemas.microsoft.com/office/word/2010/wordprocessingInk" xmlns:wps="http://schemas.microsoft.com/office/word/2010/wordprocessingShape" mc:Ignorable="w14 wp14">
-  <w:p>
-    <w:pPr>
-      <w:pStyle w:val="Header"/>
-      <w:jc w:val="center"/>
-    </w:pPr>
-    <w:r/>
-    <w:r>
-      <w:rPr>
-        <w:rFonts w:ascii="宋体" w:hAnsi="宋体" w:eastAsia="宋体"/>
-        <w:b w:val="0"/>
-        <w:sz w:val="16"/>
-      </w:rPr>
-      <w:t>墨译漫画小说智能翻译软件 V1.1.0  软件说明书</w:t>
     </w:r>
   </w:p>
 </w:hdr>

</xml_diff>

<commit_message>
docs(softcopyright): polish layout and add one-pass review guide
- core-first 60-page source sample; last page ends complete module
- larger source font and two-line header with page number top right
- expand manual to 17 pages: operation steps, UI buttons, design/algorithm notes
- add once-pass review checklist based on common correction reasons
- refresh PDFs, hashes and page counts
</commit_message>
<xml_diff>
--- a/softcopyright/01-软件说明书.docx
+++ b/softcopyright/01-软件说明书.docx
@@ -1558,6 +1558,844 @@
           <w:sz w:val="21"/>
         </w:rPr>
         <w:t>V1.1.0：新增原生 det+rec、Noto Sans CJK、PDF 导出、术语表、气泡校对；具体变更见 CHANGELOG.md。</w:t>
+      </w:r>
+    </w:p>
+    <w:p>
+      <w:pPr>
+        <w:spacing w:before="200" w:after="120"/>
+      </w:pPr>
+      <w:r>
+        <w:rPr>
+          <w:rFonts w:ascii="黑体" w:hAnsi="黑体" w:eastAsia="黑体"/>
+          <w:b/>
+          <w:sz w:val="30"/>
+        </w:rPr>
+        <w:t>附录 C 操作步骤与界面说明</w:t>
+      </w:r>
+    </w:p>
+    <w:p>
+      <w:pPr>
+        <w:spacing w:line="360" w:lineRule="auto" w:after="80"/>
+        <w:ind w:firstLine="420"/>
+        <w:jc w:val="both"/>
+      </w:pPr>
+      <w:r>
+        <w:rPr>
+          <w:rFonts w:ascii="宋体" w:hAnsi="宋体" w:eastAsia="宋体"/>
+          <w:b w:val="0"/>
+          <w:sz w:val="21"/>
+        </w:rPr>
+        <w:t>本附录按用户实际使用顺序说明主要界面与按钮，便于审查人员核对软件功能与截图、源程序的一致性。</w:t>
+      </w:r>
+    </w:p>
+    <w:p>
+      <w:pPr>
+        <w:spacing w:before="120" w:after="80"/>
+      </w:pPr>
+      <w:r>
+        <w:rPr>
+          <w:rFonts w:ascii="黑体" w:hAnsi="黑体" w:eastAsia="黑体"/>
+          <w:b/>
+          <w:sz w:val="24"/>
+        </w:rPr>
+        <w:t>C.1 首次启动与书架</w:t>
+      </w:r>
+    </w:p>
+    <w:p>
+      <w:pPr>
+        <w:spacing w:line="360" w:lineRule="auto" w:after="80"/>
+        <w:ind w:firstLine="420"/>
+        <w:jc w:val="both"/>
+      </w:pPr>
+      <w:r>
+        <w:rPr>
+          <w:rFonts w:ascii="宋体" w:hAnsi="宋体" w:eastAsia="宋体"/>
+          <w:b w:val="0"/>
+          <w:sz w:val="21"/>
+        </w:rPr>
+        <w:t>首次启动进入书架页，底部为“书架 / 翻译 / 历史 / 我的”四个入口；大屏设备自动切换为左侧导航轨。</w:t>
+      </w:r>
+    </w:p>
+    <w:p>
+      <w:pPr>
+        <w:spacing w:line="360" w:lineRule="auto" w:after="80"/>
+        <w:ind w:firstLine="420"/>
+        <w:jc w:val="both"/>
+      </w:pPr>
+      <w:r>
+        <w:rPr>
+          <w:rFonts w:ascii="宋体" w:hAnsi="宋体" w:eastAsia="宋体"/>
+          <w:b w:val="0"/>
+          <w:sz w:val="21"/>
+        </w:rPr>
+        <w:t>书架页顶部显示“漫画书架”、漫画数量和“导入”按钮；点击“导入”后选择本地 ZIP/CBZ、图片目录或相册图片，导入完成后生成漫画卡片。</w:t>
+      </w:r>
+    </w:p>
+    <w:p>
+      <w:pPr>
+        <w:spacing w:line="360" w:lineRule="auto" w:after="80"/>
+        <w:ind w:firstLine="420"/>
+        <w:jc w:val="both"/>
+      </w:pPr>
+      <w:r>
+        <w:rPr>
+          <w:rFonts w:ascii="宋体" w:hAnsi="宋体" w:eastAsia="宋体"/>
+          <w:b w:val="0"/>
+          <w:sz w:val="21"/>
+        </w:rPr>
+        <w:t>漫画卡片显示封面、标题、页数和“未翻译 / 已翻译”状态；点击卡片进入阅读器。书架支持“最近”排序和按翻译状态筛选。</w:t>
+      </w:r>
+    </w:p>
+    <w:p>
+      <w:pPr>
+        <w:spacing w:line="360" w:lineRule="auto" w:after="80"/>
+        <w:ind w:firstLine="420"/>
+        <w:jc w:val="both"/>
+      </w:pPr>
+      <w:r>
+        <w:rPr>
+          <w:rFonts w:ascii="宋体" w:hAnsi="宋体" w:eastAsia="宋体"/>
+          <w:b w:val="0"/>
+          <w:sz w:val="21"/>
+        </w:rPr>
+        <w:t>“小说”页签用于导入 TXT/EPUB 等小说文件，导入后按章节生成目录。</w:t>
+      </w:r>
+    </w:p>
+    <w:p>
+      <w:pPr>
+        <w:spacing w:before="120" w:after="80"/>
+      </w:pPr>
+      <w:r>
+        <w:rPr>
+          <w:rFonts w:ascii="黑体" w:hAnsi="黑体" w:eastAsia="黑体"/>
+          <w:b/>
+          <w:sz w:val="24"/>
+        </w:rPr>
+        <w:t>C.2 阅读器</w:t>
+      </w:r>
+    </w:p>
+    <w:p>
+      <w:pPr>
+        <w:spacing w:line="360" w:lineRule="auto" w:after="80"/>
+        <w:ind w:firstLine="420"/>
+        <w:jc w:val="both"/>
+      </w:pPr>
+      <w:r>
+        <w:rPr>
+          <w:rFonts w:ascii="宋体" w:hAnsi="宋体" w:eastAsia="宋体"/>
+          <w:b w:val="0"/>
+          <w:sz w:val="21"/>
+        </w:rPr>
+        <w:t>阅读器页面中央为当前页图片，底部显示页码和进度；点击页面中央打开菜单，菜单包含“翻译本页”“导出ZIP”“目录”“设置”等入口。</w:t>
+      </w:r>
+    </w:p>
+    <w:p>
+      <w:pPr>
+        <w:spacing w:line="360" w:lineRule="auto" w:after="80"/>
+        <w:ind w:firstLine="420"/>
+        <w:jc w:val="both"/>
+      </w:pPr>
+      <w:r>
+        <w:rPr>
+          <w:rFonts w:ascii="宋体" w:hAnsi="宋体" w:eastAsia="宋体"/>
+          <w:b w:val="0"/>
+          <w:sz w:val="21"/>
+        </w:rPr>
+        <w:t>左右点击屏幕两侧可翻页；点击左右边缘的区域宽度、翻页方向、动画效果可在阅读设置中调整。</w:t>
+      </w:r>
+    </w:p>
+    <w:p>
+      <w:pPr>
+        <w:spacing w:line="360" w:lineRule="auto" w:after="80"/>
+        <w:ind w:firstLine="420"/>
+        <w:jc w:val="both"/>
+      </w:pPr>
+      <w:r>
+        <w:rPr>
+          <w:rFonts w:ascii="宋体" w:hAnsi="宋体" w:eastAsia="宋体"/>
+          <w:b w:val="0"/>
+          <w:sz w:val="21"/>
+        </w:rPr>
+        <w:t>阅读设置支持左到右、右到左、竖排整页、连续 Webtoon 四种阅读流，以及背景色、反色、灰度、亮度、对比度、字体大小、行距和横竖排。</w:t>
+      </w:r>
+    </w:p>
+    <w:p>
+      <w:pPr>
+        <w:spacing w:line="360" w:lineRule="auto" w:after="80"/>
+        <w:ind w:firstLine="420"/>
+        <w:jc w:val="both"/>
+      </w:pPr>
+      <w:r>
+        <w:rPr>
+          <w:rFonts w:ascii="宋体" w:hAnsi="宋体" w:eastAsia="宋体"/>
+          <w:b w:val="0"/>
+          <w:sz w:val="21"/>
+        </w:rPr>
+        <w:t>“目录”打开缩略图网格，可跳转到任意页；“设置”打开阅读参数面板；参数保存在本机，下次打开继续生效。</w:t>
+      </w:r>
+    </w:p>
+    <w:p>
+      <w:pPr>
+        <w:spacing w:before="120" w:after="80"/>
+      </w:pPr>
+      <w:r>
+        <w:rPr>
+          <w:rFonts w:ascii="黑体" w:hAnsi="黑体" w:eastAsia="黑体"/>
+          <w:b/>
+          <w:sz w:val="24"/>
+        </w:rPr>
+        <w:t>C.3 翻译本页</w:t>
+      </w:r>
+    </w:p>
+    <w:p>
+      <w:pPr>
+        <w:spacing w:line="360" w:lineRule="auto" w:after="80"/>
+        <w:ind w:firstLine="420"/>
+        <w:jc w:val="both"/>
+      </w:pPr>
+      <w:r>
+        <w:rPr>
+          <w:rFonts w:ascii="宋体" w:hAnsi="宋体" w:eastAsia="宋体"/>
+          <w:b w:val="0"/>
+          <w:sz w:val="21"/>
+        </w:rPr>
+        <w:t>在阅读器菜单点击“翻译本页”，软件依次执行页面解码、OCR、翻译和保存。进度条按阶段显示“解码页面”“识别文字”“翻译 x/y 行”“保存”。</w:t>
+      </w:r>
+    </w:p>
+    <w:p>
+      <w:pPr>
+        <w:spacing w:line="360" w:lineRule="auto" w:after="80"/>
+        <w:ind w:firstLine="420"/>
+        <w:jc w:val="both"/>
+      </w:pPr>
+      <w:r>
+        <w:rPr>
+          <w:rFonts w:ascii="宋体" w:hAnsi="宋体" w:eastAsia="宋体"/>
+          <w:b w:val="0"/>
+          <w:sz w:val="21"/>
+        </w:rPr>
+        <w:t>OCR 可选择系统 Core Vision 或本地 PP-OCRv6；本地模型需先在“设置 → OCR”下载。翻译引擎可选择免 Key 的必应、OpenAI 兼容 API 或本地 llama.cpp。</w:t>
+      </w:r>
+    </w:p>
+    <w:p>
+      <w:pPr>
+        <w:spacing w:line="360" w:lineRule="auto" w:after="80"/>
+        <w:ind w:firstLine="420"/>
+        <w:jc w:val="both"/>
+      </w:pPr>
+      <w:r>
+        <w:rPr>
+          <w:rFonts w:ascii="宋体" w:hAnsi="宋体" w:eastAsia="宋体"/>
+          <w:b w:val="0"/>
+          <w:sz w:val="21"/>
+        </w:rPr>
+        <w:t>翻译完成后，译文按页面坐标覆盖到原图；合并气泡内的多行译文会按气泡整体排版。译文块支持自动字号、横竖排和逐块黑白字/描边。</w:t>
+      </w:r>
+    </w:p>
+    <w:p>
+      <w:pPr>
+        <w:spacing w:before="120" w:after="80"/>
+      </w:pPr>
+      <w:r>
+        <w:rPr>
+          <w:rFonts w:ascii="黑体" w:hAnsi="黑体" w:eastAsia="黑体"/>
+          <w:b/>
+          <w:sz w:val="24"/>
+        </w:rPr>
+        <w:t>C.4 气泡校对</w:t>
+      </w:r>
+    </w:p>
+    <w:p>
+      <w:pPr>
+        <w:spacing w:line="360" w:lineRule="auto" w:after="80"/>
+        <w:ind w:firstLine="420"/>
+        <w:jc w:val="both"/>
+      </w:pPr>
+      <w:r>
+        <w:rPr>
+          <w:rFonts w:ascii="宋体" w:hAnsi="宋体" w:eastAsia="宋体"/>
+          <w:b w:val="0"/>
+          <w:sz w:val="21"/>
+        </w:rPr>
+        <w:t>对未合并的单行气泡长按，弹出“校对译文”对话框；输入框显示当前译文，点击“保存”后更新本页翻译结果并立即重绘，点击“取消”不修改。</w:t>
+      </w:r>
+    </w:p>
+    <w:p>
+      <w:pPr>
+        <w:spacing w:line="360" w:lineRule="auto" w:after="80"/>
+        <w:ind w:firstLine="420"/>
+        <w:jc w:val="both"/>
+      </w:pPr>
+      <w:r>
+        <w:rPr>
+          <w:rFonts w:ascii="宋体" w:hAnsi="宋体" w:eastAsia="宋体"/>
+          <w:b w:val="0"/>
+          <w:sz w:val="21"/>
+        </w:rPr>
+        <w:t>合并气泡暂不支持逐行编辑；需要修改时先关闭气泡合并或重新翻译该页。</w:t>
+      </w:r>
+    </w:p>
+    <w:p>
+      <w:pPr>
+        <w:spacing w:before="120" w:after="80"/>
+      </w:pPr>
+      <w:r>
+        <w:rPr>
+          <w:rFonts w:ascii="黑体" w:hAnsi="黑体" w:eastAsia="黑体"/>
+          <w:b/>
+          <w:sz w:val="24"/>
+        </w:rPr>
+        <w:t>C.5 导出</w:t>
+      </w:r>
+    </w:p>
+    <w:p>
+      <w:pPr>
+        <w:spacing w:line="360" w:lineRule="auto" w:after="80"/>
+        <w:ind w:firstLine="420"/>
+        <w:jc w:val="both"/>
+      </w:pPr>
+      <w:r>
+        <w:rPr>
+          <w:rFonts w:ascii="宋体" w:hAnsi="宋体" w:eastAsia="宋体"/>
+          <w:b w:val="0"/>
+          <w:sz w:val="21"/>
+        </w:rPr>
+        <w:t>点击“导出ZIP”打开导出模式：仅原文、仅译文、双语对照。仅原文直接归集原图；仅译文合成译文页；双语对照按页序交替原文和译文页。</w:t>
+      </w:r>
+    </w:p>
+    <w:p>
+      <w:pPr>
+        <w:spacing w:line="360" w:lineRule="auto" w:after="80"/>
+        <w:ind w:firstLine="420"/>
+        <w:jc w:val="both"/>
+      </w:pPr>
+      <w:r>
+        <w:rPr>
+          <w:rFonts w:ascii="宋体" w:hAnsi="宋体" w:eastAsia="宋体"/>
+          <w:b w:val="0"/>
+          <w:sz w:val="21"/>
+        </w:rPr>
+        <w:t>点击“导出 PDF”将译文合成页写入 PDF，保存到应用文件目录，完成提示会显示路径。PDF 导出依赖系统 PDF Kit；不支持时改用 ZIP。</w:t>
+      </w:r>
+    </w:p>
+    <w:p>
+      <w:pPr>
+        <w:spacing w:before="120" w:after="80"/>
+      </w:pPr>
+      <w:r>
+        <w:rPr>
+          <w:rFonts w:ascii="黑体" w:hAnsi="黑体" w:eastAsia="黑体"/>
+          <w:b/>
+          <w:sz w:val="24"/>
+        </w:rPr>
+        <w:t>C.6 术语表与翻译记忆</w:t>
+      </w:r>
+    </w:p>
+    <w:p>
+      <w:pPr>
+        <w:spacing w:line="360" w:lineRule="auto" w:after="80"/>
+        <w:ind w:firstLine="420"/>
+        <w:jc w:val="both"/>
+      </w:pPr>
+      <w:r>
+        <w:rPr>
+          <w:rFonts w:ascii="宋体" w:hAnsi="宋体" w:eastAsia="宋体"/>
+          <w:b w:val="0"/>
+          <w:sz w:val="21"/>
+        </w:rPr>
+        <w:t>路径为“设置 → 翻译 → 术语表”。点击“导入”选择 JSON 文件，格式为数组，每项包含 s（原文）和 t（译文），例如 [{"s":"原文","t":"译文"}]。</w:t>
+      </w:r>
+    </w:p>
+    <w:p>
+      <w:pPr>
+        <w:spacing w:line="360" w:lineRule="auto" w:after="80"/>
+        <w:ind w:firstLine="420"/>
+        <w:jc w:val="both"/>
+      </w:pPr>
+      <w:r>
+        <w:rPr>
+          <w:rFonts w:ascii="宋体" w:hAnsi="宋体" w:eastAsia="宋体"/>
+          <w:b w:val="0"/>
+          <w:sz w:val="21"/>
+        </w:rPr>
+        <w:t>翻译前按最长优先替换术语；页翻译完成后自动写入翻译记忆，最多保留 2000 条，重复原文可直接复用译文。点击“清空”删除术语表。</w:t>
+      </w:r>
+    </w:p>
+    <w:p>
+      <w:pPr>
+        <w:spacing w:before="120" w:after="80"/>
+      </w:pPr>
+      <w:r>
+        <w:rPr>
+          <w:rFonts w:ascii="黑体" w:hAnsi="黑体" w:eastAsia="黑体"/>
+          <w:b/>
+          <w:sz w:val="24"/>
+        </w:rPr>
+        <w:t>C.7 本地模型</w:t>
+      </w:r>
+    </w:p>
+    <w:p>
+      <w:pPr>
+        <w:spacing w:line="360" w:lineRule="auto" w:after="80"/>
+        <w:ind w:firstLine="420"/>
+        <w:jc w:val="both"/>
+      </w:pPr>
+      <w:r>
+        <w:rPr>
+          <w:rFonts w:ascii="宋体" w:hAnsi="宋体" w:eastAsia="宋体"/>
+          <w:b w:val="0"/>
+          <w:sz w:val="21"/>
+        </w:rPr>
+        <w:t>本地 OCR：设置 → OCR → 本地 PP-OCRv6，点击“下载”自动下载检测和识别模型并启用；页面显示“已下载”和文件路径。</w:t>
+      </w:r>
+    </w:p>
+    <w:p>
+      <w:pPr>
+        <w:spacing w:line="360" w:lineRule="auto" w:after="80"/>
+        <w:ind w:firstLine="420"/>
+        <w:jc w:val="both"/>
+      </w:pPr>
+      <w:r>
+        <w:rPr>
+          <w:rFonts w:ascii="宋体" w:hAnsi="宋体" w:eastAsia="宋体"/>
+          <w:b w:val="0"/>
+          <w:sz w:val="21"/>
+        </w:rPr>
+        <w:t>本地翻译：模型管理导入 .gguf 文件，应用会复制到沙箱；导入成功后可在翻译设置选择本地 llama.cpp。模型不随安装包分发。</w:t>
+      </w:r>
+    </w:p>
+    <w:p>
+      <w:pPr>
+        <w:spacing w:before="120" w:after="80"/>
+      </w:pPr>
+      <w:r>
+        <w:rPr>
+          <w:rFonts w:ascii="黑体" w:hAnsi="黑体" w:eastAsia="黑体"/>
+          <w:b/>
+          <w:sz w:val="24"/>
+        </w:rPr>
+        <w:t>C.8 常见提示与限制</w:t>
+      </w:r>
+    </w:p>
+    <w:p>
+      <w:pPr>
+        <w:spacing w:line="360" w:lineRule="auto" w:after="80"/>
+        <w:ind w:firstLine="420"/>
+        <w:jc w:val="both"/>
+      </w:pPr>
+      <w:r>
+        <w:rPr>
+          <w:rFonts w:ascii="宋体" w:hAnsi="宋体" w:eastAsia="宋体"/>
+          <w:b w:val="0"/>
+          <w:sz w:val="21"/>
+        </w:rPr>
+        <w:t>图片加载失败时检查文件是否被移动或删除，重新导入；OCR 无结果时确认模型已下载，复杂背景或超大框会被过滤；翻译失败时检查网络、API Key 或模型路径。</w:t>
+      </w:r>
+    </w:p>
+    <w:p>
+      <w:pPr>
+        <w:spacing w:line="360" w:lineRule="auto" w:after="80"/>
+        <w:ind w:firstLine="420"/>
+        <w:jc w:val="both"/>
+      </w:pPr>
+      <w:r>
+        <w:rPr>
+          <w:rFonts w:ascii="宋体" w:hAnsi="宋体" w:eastAsia="宋体"/>
+          <w:b w:val="0"/>
+          <w:sz w:val="21"/>
+        </w:rPr>
+        <w:t>软件不内置漫画/小说内容，用户应仅导入有权使用的内容；AI 翻译结果可能存在错误，导出或公开传播前应人工校对。</w:t>
+      </w:r>
+    </w:p>
+    <w:p>
+      <w:pPr>
+        <w:spacing w:before="200" w:after="120"/>
+      </w:pPr>
+      <w:r>
+        <w:rPr>
+          <w:rFonts w:ascii="黑体" w:hAnsi="黑体" w:eastAsia="黑体"/>
+          <w:b/>
+          <w:sz w:val="30"/>
+        </w:rPr>
+        <w:t>附录 D 软件设计说明</w:t>
+      </w:r>
+    </w:p>
+    <w:p>
+      <w:pPr>
+        <w:spacing w:before="120" w:after="80"/>
+      </w:pPr>
+      <w:r>
+        <w:rPr>
+          <w:rFonts w:ascii="黑体" w:hAnsi="黑体" w:eastAsia="黑体"/>
+          <w:b/>
+          <w:sz w:val="24"/>
+        </w:rPr>
+        <w:t>D.1 总体架构</w:t>
+      </w:r>
+    </w:p>
+    <w:p>
+      <w:pPr>
+        <w:spacing w:line="360" w:lineRule="auto" w:after="80"/>
+        <w:ind w:firstLine="420"/>
+        <w:jc w:val="both"/>
+      </w:pPr>
+      <w:r>
+        <w:rPr>
+          <w:rFonts w:ascii="宋体" w:hAnsi="宋体" w:eastAsia="宋体"/>
+          <w:b w:val="0"/>
+          <w:sz w:val="21"/>
+        </w:rPr>
+        <w:t>软件采用 HarmonyOS Stage 模型和 HAR 多模块架构。entry 模块负责应用入口、页面、交互、数据访问与系统能力；commons 提供主题、断点、日志、路径等公共能力。</w:t>
+      </w:r>
+    </w:p>
+    <w:p>
+      <w:pPr>
+        <w:spacing w:line="360" w:lineRule="auto" w:after="80"/>
+        <w:ind w:firstLine="420"/>
+        <w:jc w:val="both"/>
+      </w:pPr>
+      <w:r>
+        <w:rPr>
+          <w:rFonts w:ascii="宋体" w:hAnsi="宋体" w:eastAsia="宋体"/>
+          <w:b w:val="0"/>
+          <w:sz w:val="21"/>
+        </w:rPr>
+        <w:t>coremodel 定义漫画、小说、页面、翻译结果、下载任务等数据模型；coreocr 封装系统 OCR、本地 PP-OCRv6 和原生 ONNX Runtime 桥；coretranslate 封装在线翻译服务与本地 llama.cpp；corerender 负责覆盖层排版与 Canvas 绘制；corenovel 负责 TXT/EPUB/ZIP-HTML 解析。</w:t>
+      </w:r>
+    </w:p>
+    <w:p>
+      <w:pPr>
+        <w:spacing w:before="120" w:after="80"/>
+      </w:pPr>
+      <w:r>
+        <w:rPr>
+          <w:rFonts w:ascii="黑体" w:hAnsi="黑体" w:eastAsia="黑体"/>
+          <w:b/>
+          <w:sz w:val="24"/>
+        </w:rPr>
+        <w:t>D.2 模块与主要功能</w:t>
+      </w:r>
+    </w:p>
+    <w:p>
+      <w:pPr>
+        <w:spacing w:line="360" w:lineRule="auto" w:after="80"/>
+        <w:ind w:firstLine="420"/>
+        <w:jc w:val="both"/>
+      </w:pPr>
+      <w:r>
+        <w:rPr>
+          <w:rFonts w:ascii="宋体" w:hAnsi="宋体" w:eastAsia="宋体"/>
+          <w:b w:val="0"/>
+          <w:sz w:val="21"/>
+        </w:rPr>
+        <w:t>entry/pages：Index、ShelfPage、ReaderPage、SettingsPage、AboutPage 等页面；entry/service：PageTranslateService、BatchTranslateService、ExportService、GlossaryService、OcrRecService 等服务。</w:t>
+      </w:r>
+    </w:p>
+    <w:p>
+      <w:pPr>
+        <w:spacing w:line="360" w:lineRule="auto" w:after="80"/>
+        <w:ind w:firstLine="420"/>
+        <w:jc w:val="both"/>
+      </w:pPr>
+      <w:r>
+        <w:rPr>
+          <w:rFonts w:ascii="宋体" w:hAnsi="宋体" w:eastAsia="宋体"/>
+          <w:b w:val="0"/>
+          <w:sz w:val="21"/>
+        </w:rPr>
+        <w:t>entry/data：MangaRepository、PageRepository、SettingsRepository、DownloadRepository 等 RDB/Preferences 访问层；entry/viewmodel：ReaderViewModel、ShelfViewModel 等状态与业务编排。</w:t>
+      </w:r>
+    </w:p>
+    <w:p>
+      <w:pPr>
+        <w:spacing w:line="360" w:lineRule="auto" w:after="80"/>
+        <w:ind w:firstLine="420"/>
+        <w:jc w:val="both"/>
+      </w:pPr>
+      <w:r>
+        <w:rPr>
+          <w:rFonts w:ascii="宋体" w:hAnsi="宋体" w:eastAsia="宋体"/>
+          <w:b w:val="0"/>
+          <w:sz w:val="21"/>
+        </w:rPr>
+        <w:t>coreocr/LocalOcrEngine：页面解码、det 预处理、连通域检测、rec 识别；entry/cpp/ocr_bridge.cpp：通过 ONNX Runtime C API 在 TaskPool 中运行 det/rec。</w:t>
+      </w:r>
+    </w:p>
+    <w:p>
+      <w:pPr>
+        <w:spacing w:line="360" w:lineRule="auto" w:after="80"/>
+        <w:ind w:firstLine="420"/>
+        <w:jc w:val="both"/>
+      </w:pPr>
+      <w:r>
+        <w:rPr>
+          <w:rFonts w:ascii="宋体" w:hAnsi="宋体" w:eastAsia="宋体"/>
+          <w:b w:val="0"/>
+          <w:sz w:val="21"/>
+        </w:rPr>
+        <w:t>coretranslate：引擎注册、OpenAI 兼容请求、必应翻译、本地 llama.cpp NAPI；corerender：LayoutEngine、OverlayRenderer、PageOverlay；corenovel：TxtParser、EpubParser、ZipHtmlParser。</w:t>
+      </w:r>
+    </w:p>
+    <w:p>
+      <w:pPr>
+        <w:spacing w:before="120" w:after="80"/>
+      </w:pPr>
+      <w:r>
+        <w:rPr>
+          <w:rFonts w:ascii="黑体" w:hAnsi="黑体" w:eastAsia="黑体"/>
+          <w:b/>
+          <w:sz w:val="24"/>
+        </w:rPr>
+        <w:t>D.3 数据处理流程</w:t>
+      </w:r>
+    </w:p>
+    <w:p>
+      <w:pPr>
+        <w:spacing w:line="360" w:lineRule="auto" w:after="80"/>
+        <w:ind w:firstLine="420"/>
+        <w:jc w:val="both"/>
+      </w:pPr>
+      <w:r>
+        <w:rPr>
+          <w:rFonts w:ascii="宋体" w:hAnsi="宋体" w:eastAsia="宋体"/>
+          <w:b w:val="0"/>
+          <w:sz w:val="21"/>
+        </w:rPr>
+        <w:t>漫画翻译主流程：导入 → 页面记录 → 阅读器解码图片 → OCR 检测/识别 → 文本行按空间位置分组 → 翻译引擎生成译文 → 页内缓存/翻译记忆 → PageTranslation 落库 → 覆盖层排版绘制 → 导出。</w:t>
+      </w:r>
+    </w:p>
+    <w:p>
+      <w:pPr>
+        <w:spacing w:line="360" w:lineRule="auto" w:after="80"/>
+        <w:ind w:firstLine="420"/>
+        <w:jc w:val="both"/>
+      </w:pPr>
+      <w:r>
+        <w:rPr>
+          <w:rFonts w:ascii="宋体" w:hAnsi="宋体" w:eastAsia="宋体"/>
+          <w:b w:val="0"/>
+          <w:sz w:val="21"/>
+        </w:rPr>
+        <w:t>小说翻译主流程：导入 → 解析章节 → 分页 → 段落切分 → 逐段翻译 → 结果缓存 → 阅读器分页显示/导出。</w:t>
+      </w:r>
+    </w:p>
+    <w:p>
+      <w:pPr>
+        <w:spacing w:line="360" w:lineRule="auto" w:after="80"/>
+        <w:ind w:firstLine="420"/>
+        <w:jc w:val="both"/>
+      </w:pPr>
+      <w:r>
+        <w:rPr>
+          <w:rFonts w:ascii="宋体" w:hAnsi="宋体" w:eastAsia="宋体"/>
+          <w:b w:val="0"/>
+          <w:sz w:val="21"/>
+        </w:rPr>
+        <w:t>导出流程：读取页序和渲染设置 → 合成原文/译文页 → 写入暂存目录 → ZIP 或 PDF → 保存选择器/应用目录 → 清理暂存。</w:t>
+      </w:r>
+    </w:p>
+    <w:p>
+      <w:pPr>
+        <w:spacing w:before="120" w:after="80"/>
+      </w:pPr>
+      <w:r>
+        <w:rPr>
+          <w:rFonts w:ascii="黑体" w:hAnsi="黑体" w:eastAsia="黑体"/>
+          <w:b/>
+          <w:sz w:val="24"/>
+        </w:rPr>
+        <w:t>D.4 关键算法</w:t>
+      </w:r>
+    </w:p>
+    <w:p>
+      <w:pPr>
+        <w:spacing w:line="360" w:lineRule="auto" w:after="80"/>
+        <w:ind w:firstLine="420"/>
+        <w:jc w:val="both"/>
+      </w:pPr>
+      <w:r>
+        <w:rPr>
+          <w:rFonts w:ascii="宋体" w:hAnsi="宋体" w:eastAsia="宋体"/>
+          <w:b w:val="0"/>
+          <w:sz w:val="21"/>
+        </w:rPr>
+        <w:t>OCR 检测：图片按长边 768 缩放，按 32 对齐；3x3 可分离膨胀连接笔画；连通域得到轴对齐框；按面积比例过滤整页大框和单字大框；相近框合并。</w:t>
+      </w:r>
+    </w:p>
+    <w:p>
+      <w:pPr>
+        <w:spacing w:line="360" w:lineRule="auto" w:after="80"/>
+        <w:ind w:firstLine="420"/>
+        <w:jc w:val="both"/>
+      </w:pPr>
+      <w:r>
+        <w:rPr>
+          <w:rFonts w:ascii="宋体" w:hAnsi="宋体" w:eastAsia="宋体"/>
+          <w:b w:val="0"/>
+          <w:sz w:val="21"/>
+        </w:rPr>
+        <w:t>OCR 识别：按框裁剪并 pad 2 像素，缩放到高 48、宽 32 对齐，归一化到 [-1,1]；rec 输出按 CTC 贪心解码，去除 blank 和连续重复。</w:t>
+      </w:r>
+    </w:p>
+    <w:p>
+      <w:pPr>
+        <w:spacing w:line="360" w:lineRule="auto" w:after="80"/>
+        <w:ind w:firstLine="420"/>
+        <w:jc w:val="both"/>
+      </w:pPr>
+      <w:r>
+        <w:rPr>
+          <w:rFonts w:ascii="宋体" w:hAnsi="宋体" w:eastAsia="宋体"/>
+          <w:b w:val="0"/>
+          <w:sz w:val="21"/>
+        </w:rPr>
+        <w:t>气泡分组：按垂直间距不超过上一行高度 0.8 倍、水平重叠超过最小宽度 25%、每组最多 4 行/600 字符分组；本地 llama 每组生成一次，再按行拆分，失败回退逐行。</w:t>
+      </w:r>
+    </w:p>
+    <w:p>
+      <w:pPr>
+        <w:spacing w:line="360" w:lineRule="auto" w:after="80"/>
+        <w:ind w:firstLine="420"/>
+        <w:jc w:val="both"/>
+      </w:pPr>
+      <w:r>
+        <w:rPr>
+          <w:rFonts w:ascii="宋体" w:hAnsi="宋体" w:eastAsia="宋体"/>
+          <w:b w:val="0"/>
+          <w:sz w:val="21"/>
+        </w:rPr>
+        <w:t>覆盖排版：以页面像素坐标建立 DisplayRect，LayoutEngine 按气泡宽高计算字号与换行；OverlayRenderer 按块绘制背景、描边、文字；逐块文本颜色来自去字底图边缘亮度采样。</w:t>
+      </w:r>
+    </w:p>
+    <w:p>
+      <w:pPr>
+        <w:spacing w:before="120" w:after="80"/>
+      </w:pPr>
+      <w:r>
+        <w:rPr>
+          <w:rFonts w:ascii="黑体" w:hAnsi="黑体" w:eastAsia="黑体"/>
+          <w:b/>
+          <w:sz w:val="24"/>
+        </w:rPr>
+        <w:t>D.5 接口与数据</w:t>
+      </w:r>
+    </w:p>
+    <w:p>
+      <w:pPr>
+        <w:spacing w:line="360" w:lineRule="auto" w:after="80"/>
+        <w:ind w:firstLine="420"/>
+        <w:jc w:val="both"/>
+      </w:pPr>
+      <w:r>
+        <w:rPr>
+          <w:rFonts w:ascii="宋体" w:hAnsi="宋体" w:eastAsia="宋体"/>
+          <w:b w:val="0"/>
+          <w:sz w:val="21"/>
+        </w:rPr>
+        <w:t>页面翻译接口：PageTranslateService.run(page, options, onProgress)；输出 PageTranslation（pageId、translations、boxes、status）。</w:t>
+      </w:r>
+    </w:p>
+    <w:p>
+      <w:pPr>
+        <w:spacing w:line="360" w:lineRule="auto" w:after="80"/>
+        <w:ind w:firstLine="420"/>
+        <w:jc w:val="both"/>
+      </w:pPr>
+      <w:r>
+        <w:rPr>
+          <w:rFonts w:ascii="宋体" w:hAnsi="宋体" w:eastAsia="宋体"/>
+          <w:b w:val="0"/>
+          <w:sz w:val="21"/>
+        </w:rPr>
+        <w:t>OCR 接口：OcrService.recognize/recognizeLocal；原生接口：initDet、initRec、detectBoxes、recognizeBoxes。</w:t>
+      </w:r>
+    </w:p>
+    <w:p>
+      <w:pPr>
+        <w:spacing w:line="360" w:lineRule="auto" w:after="80"/>
+        <w:ind w:firstLine="420"/>
+        <w:jc w:val="both"/>
+      </w:pPr>
+      <w:r>
+        <w:rPr>
+          <w:rFonts w:ascii="宋体" w:hAnsi="宋体" w:eastAsia="宋体"/>
+          <w:b w:val="0"/>
+          <w:sz w:val="21"/>
+        </w:rPr>
+        <w:t>翻译接口：Translator.translate(TranslateRequest)；引擎注册表按 EngineType 选择必应、OpenAI 兼容或本地 llama.cpp。</w:t>
+      </w:r>
+    </w:p>
+    <w:p>
+      <w:pPr>
+        <w:spacing w:line="360" w:lineRule="auto" w:after="80"/>
+        <w:ind w:firstLine="420"/>
+        <w:jc w:val="both"/>
+      </w:pPr>
+      <w:r>
+        <w:rPr>
+          <w:rFonts w:ascii="宋体" w:hAnsi="宋体" w:eastAsia="宋体"/>
+          <w:b w:val="0"/>
+          <w:sz w:val="21"/>
+        </w:rPr>
+        <w:t>数据表：manga、manga_page、page_translation、text_translation、download_task；图片、清理底图、翻译记忆、术语表存放在应用沙箱。</w:t>
+      </w:r>
+    </w:p>
+    <w:p>
+      <w:pPr>
+        <w:spacing w:before="120" w:after="80"/>
+      </w:pPr>
+      <w:r>
+        <w:rPr>
+          <w:rFonts w:ascii="黑体" w:hAnsi="黑体" w:eastAsia="黑体"/>
+          <w:b/>
+          <w:sz w:val="24"/>
+        </w:rPr>
+        <w:t>D.6 异常处理与边界</w:t>
+      </w:r>
+    </w:p>
+    <w:p>
+      <w:pPr>
+        <w:spacing w:line="360" w:lineRule="auto" w:after="80"/>
+        <w:ind w:firstLine="420"/>
+        <w:jc w:val="both"/>
+      </w:pPr>
+      <w:r>
+        <w:rPr>
+          <w:rFonts w:ascii="宋体" w:hAnsi="宋体" w:eastAsia="宋体"/>
+          <w:b w:val="0"/>
+          <w:sz w:val="21"/>
+        </w:rPr>
+        <w:t>OCR 模型未下载、模型文件损坏、ONNX 初始化失败时回退系统 OCR；网络翻译失败时保留原文并记录失败行；本地模型路径无效时提示重新导入。</w:t>
+      </w:r>
+    </w:p>
+    <w:p>
+      <w:pPr>
+        <w:spacing w:line="360" w:lineRule="auto" w:after="80"/>
+        <w:ind w:firstLine="420"/>
+        <w:jc w:val="both"/>
+      </w:pPr>
+      <w:r>
+        <w:rPr>
+          <w:rFonts w:ascii="宋体" w:hAnsi="宋体" w:eastAsia="宋体"/>
+          <w:b w:val="0"/>
+          <w:sz w:val="21"/>
+        </w:rPr>
+        <w:t>页面过大时 OCR 限制长边并过滤异常框；导出合成失败时回退原图并计数；PDF Kit 不可用时提示改用 ZIP；存储空间不足时提示清理缓存。</w:t>
+      </w:r>
+    </w:p>
+    <w:p>
+      <w:pPr>
+        <w:spacing w:line="360" w:lineRule="auto" w:after="80"/>
+        <w:ind w:firstLine="420"/>
+        <w:jc w:val="both"/>
+      </w:pPr>
+      <w:r>
+        <w:rPr>
+          <w:rFonts w:ascii="宋体" w:hAnsi="宋体" w:eastAsia="宋体"/>
+          <w:b w:val="0"/>
+          <w:sz w:val="21"/>
+        </w:rPr>
+        <w:t>软件不上传整本漫画；在线翻译仅发送待翻译文本；本地模式图片和文本不离开设备。</w:t>
       </w:r>
     </w:p>
     <w:sectPr>

</xml_diff>

<commit_message>
docs(softcopyright): remove blank manual pages and expand content
- rebuild 22-page manual without blank pages
- add detailed operation, UI, design, data-flow and algorithm sections
- keep tables intact across page breaks; add screenshot grid
- update page counts and PDF hashes
</commit_message>
<xml_diff>
--- a/softcopyright/01-软件说明书.docx
+++ b/softcopyright/01-软件说明书.docx
@@ -322,8 +322,87 @@
       </w:r>
     </w:p>
     <w:p>
+      <w:pPr>
+        <w:spacing w:before="120" w:after="80"/>
+      </w:pPr>
       <w:r>
-        <w:br w:type="page"/>
+        <w:rPr>
+          <w:rFonts w:ascii="黑体" w:hAnsi="黑体" w:eastAsia="黑体"/>
+          <w:b/>
+          <w:sz w:val="24"/>
+        </w:rPr>
+        <w:t>1.1 编写目的</w:t>
+      </w:r>
+    </w:p>
+    <w:p>
+      <w:pPr>
+        <w:spacing w:line="360" w:lineRule="auto" w:after="80"/>
+        <w:ind w:firstLine="420"/>
+        <w:jc w:val="both"/>
+      </w:pPr>
+      <w:r>
+        <w:rPr>
+          <w:rFonts w:ascii="宋体" w:hAnsi="宋体" w:eastAsia="宋体"/>
+          <w:b w:val="0"/>
+          <w:sz w:val="21"/>
+        </w:rPr>
+        <w:t>本说明书用于说明墨译漫画小说智能翻译软件的功能范围、运行环境、操作流程、模块设计和异常处理，作为软件著作权登记文档鉴别材料，同时供用户和审查人员了解软件的实际能力。</w:t>
+      </w:r>
+    </w:p>
+    <w:p>
+      <w:pPr>
+        <w:spacing w:before="120" w:after="80"/>
+      </w:pPr>
+      <w:r>
+        <w:rPr>
+          <w:rFonts w:ascii="黑体" w:hAnsi="黑体" w:eastAsia="黑体"/>
+          <w:b/>
+          <w:sz w:val="24"/>
+        </w:rPr>
+        <w:t>1.2 读者对象</w:t>
+      </w:r>
+    </w:p>
+    <w:p>
+      <w:pPr>
+        <w:spacing w:line="360" w:lineRule="auto" w:after="80"/>
+        <w:ind w:firstLine="420"/>
+        <w:jc w:val="both"/>
+      </w:pPr>
+      <w:r>
+        <w:rPr>
+          <w:rFonts w:ascii="宋体" w:hAnsi="宋体" w:eastAsia="宋体"/>
+          <w:b w:val="0"/>
+          <w:sz w:val="21"/>
+        </w:rPr>
+        <w:t>目标读者包括：使用本软件阅读和翻译漫画/小说的普通用户、进行应用商店审核的人员、软件著作权登记审查人员，以及后续维护本项目的开发人员。</w:t>
+      </w:r>
+    </w:p>
+    <w:p>
+      <w:pPr>
+        <w:spacing w:before="120" w:after="80"/>
+      </w:pPr>
+      <w:r>
+        <w:rPr>
+          <w:rFonts w:ascii="黑体" w:hAnsi="黑体" w:eastAsia="黑体"/>
+          <w:b/>
+          <w:sz w:val="24"/>
+        </w:rPr>
+        <w:t>1.3 术语</w:t>
+      </w:r>
+    </w:p>
+    <w:p>
+      <w:pPr>
+        <w:spacing w:line="360" w:lineRule="auto" w:after="80"/>
+        <w:ind w:firstLine="420"/>
+        <w:jc w:val="both"/>
+      </w:pPr>
+      <w:r>
+        <w:rPr>
+          <w:rFonts w:ascii="宋体" w:hAnsi="宋体" w:eastAsia="宋体"/>
+          <w:b w:val="0"/>
+          <w:sz w:val="21"/>
+        </w:rPr>
+        <w:t>OCR：光学字符识别；det：文本检测模型；rec：文本识别模型；覆盖层：按原页面坐标绘制译文文字的透明画布；气泡：漫画中承载对话的闭合区域；术语表：用户导入的专名替换表。</w:t>
       </w:r>
     </w:p>
     <w:p>
@@ -400,9 +479,318 @@
       </w:r>
     </w:p>
     <w:p>
+      <w:pPr>
+        <w:spacing w:line="360" w:lineRule="auto" w:after="80"/>
+        <w:ind w:firstLine="420"/>
+        <w:jc w:val="both"/>
+      </w:pPr>
       <w:r>
-        <w:br w:type="page"/>
+        <w:rPr>
+          <w:rFonts w:ascii="宋体" w:hAnsi="宋体" w:eastAsia="宋体"/>
+          <w:b w:val="0"/>
+          <w:sz w:val="21"/>
+        </w:rPr>
+        <w:t>软件运行环境汇总如下表。</w:t>
       </w:r>
+    </w:p>
+    <w:tbl>
+      <w:tblPr>
+        <w:tblStyle w:val="TableGrid"/>
+        <w:tblW w:type="auto" w:w="0"/>
+        <w:tblLayout w:type="autofit"/>
+        <w:tblLook w:firstColumn="1" w:firstRow="1" w:lastColumn="0" w:lastRow="0" w:noHBand="0" w:noVBand="1" w:val="04A0"/>
+      </w:tblPr>
+      <w:tblGrid>
+        <w:gridCol w:w="4819"/>
+        <w:gridCol w:w="4819"/>
+      </w:tblGrid>
+      <w:tr>
+        <w:tc>
+          <w:tcPr>
+            <w:tcW w:type="dxa" w:w="4819"/>
+            <w:shd w:fill="E8EEF7"/>
+          </w:tcPr>
+          <w:p>
+            <w:pPr>
+              <w:jc w:val="center"/>
+            </w:pPr>
+            <w:r/>
+            <w:r>
+              <w:rPr>
+                <w:rFonts w:ascii="黑体" w:hAnsi="黑体" w:eastAsia="黑体"/>
+                <w:b/>
+                <w:sz w:val="18"/>
+              </w:rPr>
+              <w:t>项目</w:t>
+            </w:r>
+          </w:p>
+        </w:tc>
+        <w:tc>
+          <w:tcPr>
+            <w:tcW w:type="dxa" w:w="4819"/>
+            <w:shd w:fill="E8EEF7"/>
+          </w:tcPr>
+          <w:p>
+            <w:pPr>
+              <w:jc w:val="center"/>
+            </w:pPr>
+            <w:r/>
+            <w:r>
+              <w:rPr>
+                <w:rFonts w:ascii="黑体" w:hAnsi="黑体" w:eastAsia="黑体"/>
+                <w:b/>
+                <w:sz w:val="18"/>
+              </w:rPr>
+              <w:t>要求</w:t>
+            </w:r>
+          </w:p>
+        </w:tc>
+      </w:tr>
+      <w:tr>
+        <w:tc>
+          <w:tcPr>
+            <w:tcW w:type="dxa" w:w="4819"/>
+          </w:tcPr>
+          <w:p>
+            <w:pPr>
+              <w:spacing w:after="40"/>
+            </w:pPr>
+            <w:r/>
+            <w:r>
+              <w:rPr>
+                <w:rFonts w:ascii="宋体" w:hAnsi="宋体" w:eastAsia="宋体"/>
+                <w:b w:val="0"/>
+                <w:sz w:val="17"/>
+              </w:rPr>
+              <w:t>设备类型</w:t>
+            </w:r>
+          </w:p>
+        </w:tc>
+        <w:tc>
+          <w:tcPr>
+            <w:tcW w:type="dxa" w:w="4819"/>
+          </w:tcPr>
+          <w:p>
+            <w:pPr>
+              <w:spacing w:after="40"/>
+            </w:pPr>
+            <w:r/>
+            <w:r>
+              <w:rPr>
+                <w:rFonts w:ascii="宋体" w:hAnsi="宋体" w:eastAsia="宋体"/>
+                <w:b w:val="0"/>
+                <w:sz w:val="17"/>
+              </w:rPr>
+              <w:t>HarmonyOS NEXT 手机、平板、2in1</w:t>
+            </w:r>
+          </w:p>
+        </w:tc>
+      </w:tr>
+      <w:tr>
+        <w:tc>
+          <w:tcPr>
+            <w:tcW w:type="dxa" w:w="4819"/>
+          </w:tcPr>
+          <w:p>
+            <w:pPr>
+              <w:spacing w:after="40"/>
+            </w:pPr>
+            <w:r/>
+            <w:r>
+              <w:rPr>
+                <w:rFonts w:ascii="宋体" w:hAnsi="宋体" w:eastAsia="宋体"/>
+                <w:b w:val="0"/>
+                <w:sz w:val="17"/>
+              </w:rPr>
+              <w:t>系统版本</w:t>
+            </w:r>
+          </w:p>
+        </w:tc>
+        <w:tc>
+          <w:tcPr>
+            <w:tcW w:type="dxa" w:w="4819"/>
+          </w:tcPr>
+          <w:p>
+            <w:pPr>
+              <w:spacing w:after="40"/>
+            </w:pPr>
+            <w:r/>
+            <w:r>
+              <w:rPr>
+                <w:rFonts w:ascii="宋体" w:hAnsi="宋体" w:eastAsia="宋体"/>
+                <w:b w:val="0"/>
+                <w:sz w:val="17"/>
+              </w:rPr>
+              <w:t>API 26 及以上</w:t>
+            </w:r>
+          </w:p>
+        </w:tc>
+      </w:tr>
+      <w:tr>
+        <w:tc>
+          <w:tcPr>
+            <w:tcW w:type="dxa" w:w="4819"/>
+          </w:tcPr>
+          <w:p>
+            <w:pPr>
+              <w:spacing w:after="40"/>
+            </w:pPr>
+            <w:r/>
+            <w:r>
+              <w:rPr>
+                <w:rFonts w:ascii="宋体" w:hAnsi="宋体" w:eastAsia="宋体"/>
+                <w:b w:val="0"/>
+                <w:sz w:val="17"/>
+              </w:rPr>
+              <w:t>内存</w:t>
+            </w:r>
+          </w:p>
+        </w:tc>
+        <w:tc>
+          <w:tcPr>
+            <w:tcW w:type="dxa" w:w="4819"/>
+          </w:tcPr>
+          <w:p>
+            <w:pPr>
+              <w:spacing w:after="40"/>
+            </w:pPr>
+            <w:r/>
+            <w:r>
+              <w:rPr>
+                <w:rFonts w:ascii="宋体" w:hAnsi="宋体" w:eastAsia="宋体"/>
+                <w:b w:val="0"/>
+                <w:sz w:val="17"/>
+              </w:rPr>
+              <w:t>建议 4GB 以上；本地 OCR/翻译建议 8GB 以上</w:t>
+            </w:r>
+          </w:p>
+        </w:tc>
+      </w:tr>
+      <w:tr>
+        <w:tc>
+          <w:tcPr>
+            <w:tcW w:type="dxa" w:w="4819"/>
+          </w:tcPr>
+          <w:p>
+            <w:pPr>
+              <w:spacing w:after="40"/>
+            </w:pPr>
+            <w:r/>
+            <w:r>
+              <w:rPr>
+                <w:rFonts w:ascii="宋体" w:hAnsi="宋体" w:eastAsia="宋体"/>
+                <w:b w:val="0"/>
+                <w:sz w:val="17"/>
+              </w:rPr>
+              <w:t>存储</w:t>
+            </w:r>
+          </w:p>
+        </w:tc>
+        <w:tc>
+          <w:tcPr>
+            <w:tcW w:type="dxa" w:w="4819"/>
+          </w:tcPr>
+          <w:p>
+            <w:pPr>
+              <w:spacing w:after="40"/>
+            </w:pPr>
+            <w:r/>
+            <w:r>
+              <w:rPr>
+                <w:rFonts w:ascii="宋体" w:hAnsi="宋体" w:eastAsia="宋体"/>
+                <w:b w:val="0"/>
+                <w:sz w:val="17"/>
+              </w:rPr>
+              <w:t>安装包约 93MB；本地模型另计</w:t>
+            </w:r>
+          </w:p>
+        </w:tc>
+      </w:tr>
+      <w:tr>
+        <w:tc>
+          <w:tcPr>
+            <w:tcW w:type="dxa" w:w="4819"/>
+          </w:tcPr>
+          <w:p>
+            <w:pPr>
+              <w:spacing w:after="40"/>
+            </w:pPr>
+            <w:r/>
+            <w:r>
+              <w:rPr>
+                <w:rFonts w:ascii="宋体" w:hAnsi="宋体" w:eastAsia="宋体"/>
+                <w:b w:val="0"/>
+                <w:sz w:val="17"/>
+              </w:rPr>
+              <w:t>网络</w:t>
+            </w:r>
+          </w:p>
+        </w:tc>
+        <w:tc>
+          <w:tcPr>
+            <w:tcW w:type="dxa" w:w="4819"/>
+          </w:tcPr>
+          <w:p>
+            <w:pPr>
+              <w:spacing w:after="40"/>
+            </w:pPr>
+            <w:r/>
+            <w:r>
+              <w:rPr>
+                <w:rFonts w:ascii="宋体" w:hAnsi="宋体" w:eastAsia="宋体"/>
+                <w:b w:val="0"/>
+                <w:sz w:val="17"/>
+              </w:rPr>
+              <w:t>在线翻译需要网络；本地模式可离线</w:t>
+            </w:r>
+          </w:p>
+        </w:tc>
+      </w:tr>
+      <w:tr>
+        <w:tc>
+          <w:tcPr>
+            <w:tcW w:type="dxa" w:w="4819"/>
+          </w:tcPr>
+          <w:p>
+            <w:pPr>
+              <w:spacing w:after="40"/>
+            </w:pPr>
+            <w:r/>
+            <w:r>
+              <w:rPr>
+                <w:rFonts w:ascii="宋体" w:hAnsi="宋体" w:eastAsia="宋体"/>
+                <w:b w:val="0"/>
+                <w:sz w:val="17"/>
+              </w:rPr>
+              <w:t>文件能力</w:t>
+            </w:r>
+          </w:p>
+        </w:tc>
+        <w:tc>
+          <w:tcPr>
+            <w:tcW w:type="dxa" w:w="4819"/>
+          </w:tcPr>
+          <w:p>
+            <w:pPr>
+              <w:spacing w:after="40"/>
+            </w:pPr>
+            <w:r/>
+            <w:r>
+              <w:rPr>
+                <w:rFonts w:ascii="宋体" w:hAnsi="宋体" w:eastAsia="宋体"/>
+                <w:b w:val="0"/>
+                <w:sz w:val="17"/>
+              </w:rPr>
+              <w:t>本地文件选择、图片解码、应用沙箱读写</w:t>
+            </w:r>
+          </w:p>
+        </w:tc>
+      </w:tr>
+    </w:tbl>
+    <w:p>
+      <w:pPr>
+        <w:spacing w:after="0"/>
+      </w:pPr>
     </w:p>
     <w:p>
       <w:pPr>
@@ -460,6 +848,90 @@
           <w:sz w:val="21"/>
         </w:rPr>
         <w:t>软件不强制注册账号，书籍、阅读进度、术语表、翻译记忆和偏好保存在本机。</w:t>
+      </w:r>
+    </w:p>
+    <w:p>
+      <w:pPr>
+        <w:spacing w:before="120" w:after="80"/>
+      </w:pPr>
+      <w:r>
+        <w:rPr>
+          <w:rFonts w:ascii="黑体" w:hAnsi="黑体" w:eastAsia="黑体"/>
+          <w:b/>
+          <w:sz w:val="24"/>
+        </w:rPr>
+        <w:t>3.1 安装</w:t>
+      </w:r>
+    </w:p>
+    <w:p>
+      <w:pPr>
+        <w:spacing w:line="360" w:lineRule="auto" w:after="80"/>
+        <w:ind w:firstLine="420"/>
+        <w:jc w:val="both"/>
+      </w:pPr>
+      <w:r>
+        <w:rPr>
+          <w:rFonts w:ascii="宋体" w:hAnsi="宋体" w:eastAsia="宋体"/>
+          <w:b w:val="0"/>
+          <w:sz w:val="21"/>
+        </w:rPr>
+        <w:t>通过华为应用市场或调试 HAP 安装后，桌面显示“墨译 Moyi”图标。首次启动进入书架页；如系统提示通知/网络权限，可按需授权，拒绝非必要权限不影响本地阅读。</w:t>
+      </w:r>
+    </w:p>
+    <w:p>
+      <w:pPr>
+        <w:spacing w:before="120" w:after="80"/>
+      </w:pPr>
+      <w:r>
+        <w:rPr>
+          <w:rFonts w:ascii="黑体" w:hAnsi="黑体" w:eastAsia="黑体"/>
+          <w:b/>
+          <w:sz w:val="24"/>
+        </w:rPr>
+        <w:t>3.2 首次配置</w:t>
+      </w:r>
+    </w:p>
+    <w:p>
+      <w:pPr>
+        <w:spacing w:line="360" w:lineRule="auto" w:after="80"/>
+        <w:ind w:firstLine="420"/>
+        <w:jc w:val="both"/>
+      </w:pPr>
+      <w:r>
+        <w:rPr>
+          <w:rFonts w:ascii="宋体" w:hAnsi="宋体" w:eastAsia="宋体"/>
+          <w:b w:val="0"/>
+          <w:sz w:val="21"/>
+        </w:rPr>
+        <w:t>使用本地 OCR 前，进入“设置 → OCR → 本地 PP-OCRv6”，点击“下载”，等待检测和识别模型下载完成；使用本地翻译前，在“模型管理”导入 GGUF 模型。</w:t>
+      </w:r>
+    </w:p>
+    <w:p>
+      <w:pPr>
+        <w:spacing w:before="120" w:after="80"/>
+      </w:pPr>
+      <w:r>
+        <w:rPr>
+          <w:rFonts w:ascii="黑体" w:hAnsi="黑体" w:eastAsia="黑体"/>
+          <w:b/>
+          <w:sz w:val="24"/>
+        </w:rPr>
+        <w:t>3.3 导入第一本漫画</w:t>
+      </w:r>
+    </w:p>
+    <w:p>
+      <w:pPr>
+        <w:spacing w:line="360" w:lineRule="auto" w:after="80"/>
+        <w:ind w:firstLine="420"/>
+        <w:jc w:val="both"/>
+      </w:pPr>
+      <w:r>
+        <w:rPr>
+          <w:rFonts w:ascii="宋体" w:hAnsi="宋体" w:eastAsia="宋体"/>
+          <w:b w:val="0"/>
+          <w:sz w:val="21"/>
+        </w:rPr>
+        <w:t>在书架页点击“导入”，选择 ZIP/CBZ、图片目录或相册图片；导入完成后点击漫画卡片进入阅读器。导入失败时检查文件是否完整、格式是否受支持。</w:t>
       </w:r>
     </w:p>
     <w:p>
@@ -516,11 +988,6 @@
       </w:r>
     </w:p>
     <w:p>
-      <w:r>
-        <w:br w:type="page"/>
-      </w:r>
-    </w:p>
-    <w:p>
       <w:pPr>
         <w:spacing w:before="200" w:after="120"/>
       </w:pPr>
@@ -652,6 +1119,512 @@
         </w:rPr>
         <w:t>多设备布局：手机使用底部标签栏，平板/2in1 使用左侧导航轨，支持沉浸光感材质和宽屏双页。</w:t>
       </w:r>
+    </w:p>
+    <w:p>
+      <w:pPr>
+        <w:spacing w:before="120" w:after="80"/>
+      </w:pPr>
+      <w:r>
+        <w:rPr>
+          <w:rFonts w:ascii="黑体" w:hAnsi="黑体" w:eastAsia="黑体"/>
+          <w:b/>
+          <w:sz w:val="24"/>
+        </w:rPr>
+        <w:t>4.1 功能清单</w:t>
+      </w:r>
+    </w:p>
+    <w:tbl>
+      <w:tblPr>
+        <w:tblStyle w:val="TableGrid"/>
+        <w:tblW w:type="auto" w:w="0"/>
+        <w:tblLayout w:type="autofit"/>
+        <w:tblLook w:firstColumn="1" w:firstRow="1" w:lastColumn="0" w:lastRow="0" w:noHBand="0" w:noVBand="1" w:val="04A0"/>
+      </w:tblPr>
+      <w:tblGrid>
+        <w:gridCol w:w="3213"/>
+        <w:gridCol w:w="3213"/>
+        <w:gridCol w:w="3213"/>
+      </w:tblGrid>
+      <w:tr>
+        <w:tc>
+          <w:tcPr>
+            <w:tcW w:type="dxa" w:w="3213"/>
+            <w:shd w:fill="E8EEF7"/>
+          </w:tcPr>
+          <w:p>
+            <w:pPr>
+              <w:jc w:val="center"/>
+            </w:pPr>
+            <w:r/>
+            <w:r>
+              <w:rPr>
+                <w:rFonts w:ascii="黑体" w:hAnsi="黑体" w:eastAsia="黑体"/>
+                <w:b/>
+                <w:sz w:val="18"/>
+              </w:rPr>
+              <w:t>功能</w:t>
+            </w:r>
+          </w:p>
+        </w:tc>
+        <w:tc>
+          <w:tcPr>
+            <w:tcW w:type="dxa" w:w="3213"/>
+            <w:shd w:fill="E8EEF7"/>
+          </w:tcPr>
+          <w:p>
+            <w:pPr>
+              <w:jc w:val="center"/>
+            </w:pPr>
+            <w:r/>
+            <w:r>
+              <w:rPr>
+                <w:rFonts w:ascii="黑体" w:hAnsi="黑体" w:eastAsia="黑体"/>
+                <w:b/>
+                <w:sz w:val="18"/>
+              </w:rPr>
+              <w:t>入口</w:t>
+            </w:r>
+          </w:p>
+        </w:tc>
+        <w:tc>
+          <w:tcPr>
+            <w:tcW w:type="dxa" w:w="3213"/>
+            <w:shd w:fill="E8EEF7"/>
+          </w:tcPr>
+          <w:p>
+            <w:pPr>
+              <w:jc w:val="center"/>
+            </w:pPr>
+            <w:r/>
+            <w:r>
+              <w:rPr>
+                <w:rFonts w:ascii="黑体" w:hAnsi="黑体" w:eastAsia="黑体"/>
+                <w:b/>
+                <w:sz w:val="18"/>
+              </w:rPr>
+              <w:t>说明</w:t>
+            </w:r>
+          </w:p>
+        </w:tc>
+      </w:tr>
+      <w:tr>
+        <w:tc>
+          <w:tcPr>
+            <w:tcW w:type="dxa" w:w="3213"/>
+          </w:tcPr>
+          <w:p>
+            <w:pPr>
+              <w:spacing w:after="40"/>
+            </w:pPr>
+            <w:r/>
+            <w:r>
+              <w:rPr>
+                <w:rFonts w:ascii="宋体" w:hAnsi="宋体" w:eastAsia="宋体"/>
+                <w:b w:val="0"/>
+                <w:sz w:val="17"/>
+              </w:rPr>
+              <w:t>漫画导入</w:t>
+            </w:r>
+          </w:p>
+        </w:tc>
+        <w:tc>
+          <w:tcPr>
+            <w:tcW w:type="dxa" w:w="3213"/>
+          </w:tcPr>
+          <w:p>
+            <w:pPr>
+              <w:spacing w:after="40"/>
+            </w:pPr>
+            <w:r/>
+            <w:r>
+              <w:rPr>
+                <w:rFonts w:ascii="宋体" w:hAnsi="宋体" w:eastAsia="宋体"/>
+                <w:b w:val="0"/>
+                <w:sz w:val="17"/>
+              </w:rPr>
+              <w:t>书架 → 导入</w:t>
+            </w:r>
+          </w:p>
+        </w:tc>
+        <w:tc>
+          <w:tcPr>
+            <w:tcW w:type="dxa" w:w="3213"/>
+          </w:tcPr>
+          <w:p>
+            <w:pPr>
+              <w:spacing w:after="40"/>
+            </w:pPr>
+            <w:r/>
+            <w:r>
+              <w:rPr>
+                <w:rFonts w:ascii="宋体" w:hAnsi="宋体" w:eastAsia="宋体"/>
+                <w:b w:val="0"/>
+                <w:sz w:val="17"/>
+              </w:rPr>
+              <w:t>ZIP/CBZ、图片目录、相册</w:t>
+            </w:r>
+          </w:p>
+        </w:tc>
+      </w:tr>
+      <w:tr>
+        <w:tc>
+          <w:tcPr>
+            <w:tcW w:type="dxa" w:w="3213"/>
+          </w:tcPr>
+          <w:p>
+            <w:pPr>
+              <w:spacing w:after="40"/>
+            </w:pPr>
+            <w:r/>
+            <w:r>
+              <w:rPr>
+                <w:rFonts w:ascii="宋体" w:hAnsi="宋体" w:eastAsia="宋体"/>
+                <w:b w:val="0"/>
+                <w:sz w:val="17"/>
+              </w:rPr>
+              <w:t>小说导入</w:t>
+            </w:r>
+          </w:p>
+        </w:tc>
+        <w:tc>
+          <w:tcPr>
+            <w:tcW w:type="dxa" w:w="3213"/>
+          </w:tcPr>
+          <w:p>
+            <w:pPr>
+              <w:spacing w:after="40"/>
+            </w:pPr>
+            <w:r/>
+            <w:r>
+              <w:rPr>
+                <w:rFonts w:ascii="宋体" w:hAnsi="宋体" w:eastAsia="宋体"/>
+                <w:b w:val="0"/>
+                <w:sz w:val="17"/>
+              </w:rPr>
+              <w:t>书架 → 小说</w:t>
+            </w:r>
+          </w:p>
+        </w:tc>
+        <w:tc>
+          <w:tcPr>
+            <w:tcW w:type="dxa" w:w="3213"/>
+          </w:tcPr>
+          <w:p>
+            <w:pPr>
+              <w:spacing w:after="40"/>
+            </w:pPr>
+            <w:r/>
+            <w:r>
+              <w:rPr>
+                <w:rFonts w:ascii="宋体" w:hAnsi="宋体" w:eastAsia="宋体"/>
+                <w:b w:val="0"/>
+                <w:sz w:val="17"/>
+              </w:rPr>
+              <w:t>TXT/EPUB 等</w:t>
+            </w:r>
+          </w:p>
+        </w:tc>
+      </w:tr>
+      <w:tr>
+        <w:tc>
+          <w:tcPr>
+            <w:tcW w:type="dxa" w:w="3213"/>
+          </w:tcPr>
+          <w:p>
+            <w:pPr>
+              <w:spacing w:after="40"/>
+            </w:pPr>
+            <w:r/>
+            <w:r>
+              <w:rPr>
+                <w:rFonts w:ascii="宋体" w:hAnsi="宋体" w:eastAsia="宋体"/>
+                <w:b w:val="0"/>
+                <w:sz w:val="17"/>
+              </w:rPr>
+              <w:t>整页翻译</w:t>
+            </w:r>
+          </w:p>
+        </w:tc>
+        <w:tc>
+          <w:tcPr>
+            <w:tcW w:type="dxa" w:w="3213"/>
+          </w:tcPr>
+          <w:p>
+            <w:pPr>
+              <w:spacing w:after="40"/>
+            </w:pPr>
+            <w:r/>
+            <w:r>
+              <w:rPr>
+                <w:rFonts w:ascii="宋体" w:hAnsi="宋体" w:eastAsia="宋体"/>
+                <w:b w:val="0"/>
+                <w:sz w:val="17"/>
+              </w:rPr>
+              <w:t>阅读器 → 翻译本页</w:t>
+            </w:r>
+          </w:p>
+        </w:tc>
+        <w:tc>
+          <w:tcPr>
+            <w:tcW w:type="dxa" w:w="3213"/>
+          </w:tcPr>
+          <w:p>
+            <w:pPr>
+              <w:spacing w:after="40"/>
+            </w:pPr>
+            <w:r/>
+            <w:r>
+              <w:rPr>
+                <w:rFonts w:ascii="宋体" w:hAnsi="宋体" w:eastAsia="宋体"/>
+                <w:b w:val="0"/>
+                <w:sz w:val="17"/>
+              </w:rPr>
+              <w:t>OCR + 翻译 + 覆盖</w:t>
+            </w:r>
+          </w:p>
+        </w:tc>
+      </w:tr>
+      <w:tr>
+        <w:tc>
+          <w:tcPr>
+            <w:tcW w:type="dxa" w:w="3213"/>
+          </w:tcPr>
+          <w:p>
+            <w:pPr>
+              <w:spacing w:after="40"/>
+            </w:pPr>
+            <w:r/>
+            <w:r>
+              <w:rPr>
+                <w:rFonts w:ascii="宋体" w:hAnsi="宋体" w:eastAsia="宋体"/>
+                <w:b w:val="0"/>
+                <w:sz w:val="17"/>
+              </w:rPr>
+              <w:t>气泡校对</w:t>
+            </w:r>
+          </w:p>
+        </w:tc>
+        <w:tc>
+          <w:tcPr>
+            <w:tcW w:type="dxa" w:w="3213"/>
+          </w:tcPr>
+          <w:p>
+            <w:pPr>
+              <w:spacing w:after="40"/>
+            </w:pPr>
+            <w:r/>
+            <w:r>
+              <w:rPr>
+                <w:rFonts w:ascii="宋体" w:hAnsi="宋体" w:eastAsia="宋体"/>
+                <w:b w:val="0"/>
+                <w:sz w:val="17"/>
+              </w:rPr>
+              <w:t>长按单行气泡</w:t>
+            </w:r>
+          </w:p>
+        </w:tc>
+        <w:tc>
+          <w:tcPr>
+            <w:tcW w:type="dxa" w:w="3213"/>
+          </w:tcPr>
+          <w:p>
+            <w:pPr>
+              <w:spacing w:after="40"/>
+            </w:pPr>
+            <w:r/>
+            <w:r>
+              <w:rPr>
+                <w:rFonts w:ascii="宋体" w:hAnsi="宋体" w:eastAsia="宋体"/>
+                <w:b w:val="0"/>
+                <w:sz w:val="17"/>
+              </w:rPr>
+              <w:t>修改译文并保存</w:t>
+            </w:r>
+          </w:p>
+        </w:tc>
+      </w:tr>
+      <w:tr>
+        <w:tc>
+          <w:tcPr>
+            <w:tcW w:type="dxa" w:w="3213"/>
+          </w:tcPr>
+          <w:p>
+            <w:pPr>
+              <w:spacing w:after="40"/>
+            </w:pPr>
+            <w:r/>
+            <w:r>
+              <w:rPr>
+                <w:rFonts w:ascii="宋体" w:hAnsi="宋体" w:eastAsia="宋体"/>
+                <w:b w:val="0"/>
+                <w:sz w:val="17"/>
+              </w:rPr>
+              <w:t>导出</w:t>
+            </w:r>
+          </w:p>
+        </w:tc>
+        <w:tc>
+          <w:tcPr>
+            <w:tcW w:type="dxa" w:w="3213"/>
+          </w:tcPr>
+          <w:p>
+            <w:pPr>
+              <w:spacing w:after="40"/>
+            </w:pPr>
+            <w:r/>
+            <w:r>
+              <w:rPr>
+                <w:rFonts w:ascii="宋体" w:hAnsi="宋体" w:eastAsia="宋体"/>
+                <w:b w:val="0"/>
+                <w:sz w:val="17"/>
+              </w:rPr>
+              <w:t>阅读器 → 导出ZIP/PDF</w:t>
+            </w:r>
+          </w:p>
+        </w:tc>
+        <w:tc>
+          <w:tcPr>
+            <w:tcW w:type="dxa" w:w="3213"/>
+          </w:tcPr>
+          <w:p>
+            <w:pPr>
+              <w:spacing w:after="40"/>
+            </w:pPr>
+            <w:r/>
+            <w:r>
+              <w:rPr>
+                <w:rFonts w:ascii="宋体" w:hAnsi="宋体" w:eastAsia="宋体"/>
+                <w:b w:val="0"/>
+                <w:sz w:val="17"/>
+              </w:rPr>
+              <w:t>原文/译文/双语/PDF</w:t>
+            </w:r>
+          </w:p>
+        </w:tc>
+      </w:tr>
+      <w:tr>
+        <w:tc>
+          <w:tcPr>
+            <w:tcW w:type="dxa" w:w="3213"/>
+          </w:tcPr>
+          <w:p>
+            <w:pPr>
+              <w:spacing w:after="40"/>
+            </w:pPr>
+            <w:r/>
+            <w:r>
+              <w:rPr>
+                <w:rFonts w:ascii="宋体" w:hAnsi="宋体" w:eastAsia="宋体"/>
+                <w:b w:val="0"/>
+                <w:sz w:val="17"/>
+              </w:rPr>
+              <w:t>术语表</w:t>
+            </w:r>
+          </w:p>
+        </w:tc>
+        <w:tc>
+          <w:tcPr>
+            <w:tcW w:type="dxa" w:w="3213"/>
+          </w:tcPr>
+          <w:p>
+            <w:pPr>
+              <w:spacing w:after="40"/>
+            </w:pPr>
+            <w:r/>
+            <w:r>
+              <w:rPr>
+                <w:rFonts w:ascii="宋体" w:hAnsi="宋体" w:eastAsia="宋体"/>
+                <w:b w:val="0"/>
+                <w:sz w:val="17"/>
+              </w:rPr>
+              <w:t>设置 → 翻译 → 术语表</w:t>
+            </w:r>
+          </w:p>
+        </w:tc>
+        <w:tc>
+          <w:tcPr>
+            <w:tcW w:type="dxa" w:w="3213"/>
+          </w:tcPr>
+          <w:p>
+            <w:pPr>
+              <w:spacing w:after="40"/>
+            </w:pPr>
+            <w:r/>
+            <w:r>
+              <w:rPr>
+                <w:rFonts w:ascii="宋体" w:hAnsi="宋体" w:eastAsia="宋体"/>
+                <w:b w:val="0"/>
+                <w:sz w:val="17"/>
+              </w:rPr>
+              <w:t>JSON 导入，最长优先替换</w:t>
+            </w:r>
+          </w:p>
+        </w:tc>
+      </w:tr>
+      <w:tr>
+        <w:tc>
+          <w:tcPr>
+            <w:tcW w:type="dxa" w:w="3213"/>
+          </w:tcPr>
+          <w:p>
+            <w:pPr>
+              <w:spacing w:after="40"/>
+            </w:pPr>
+            <w:r/>
+            <w:r>
+              <w:rPr>
+                <w:rFonts w:ascii="宋体" w:hAnsi="宋体" w:eastAsia="宋体"/>
+                <w:b w:val="0"/>
+                <w:sz w:val="17"/>
+              </w:rPr>
+              <w:t>本地模型</w:t>
+            </w:r>
+          </w:p>
+        </w:tc>
+        <w:tc>
+          <w:tcPr>
+            <w:tcW w:type="dxa" w:w="3213"/>
+          </w:tcPr>
+          <w:p>
+            <w:pPr>
+              <w:spacing w:after="40"/>
+            </w:pPr>
+            <w:r/>
+            <w:r>
+              <w:rPr>
+                <w:rFonts w:ascii="宋体" w:hAnsi="宋体" w:eastAsia="宋体"/>
+                <w:b w:val="0"/>
+                <w:sz w:val="17"/>
+              </w:rPr>
+              <w:t>设置 → OCR / 模型管理</w:t>
+            </w:r>
+          </w:p>
+        </w:tc>
+        <w:tc>
+          <w:tcPr>
+            <w:tcW w:type="dxa" w:w="3213"/>
+          </w:tcPr>
+          <w:p>
+            <w:pPr>
+              <w:spacing w:after="40"/>
+            </w:pPr>
+            <w:r/>
+            <w:r>
+              <w:rPr>
+                <w:rFonts w:ascii="宋体" w:hAnsi="宋体" w:eastAsia="宋体"/>
+                <w:b w:val="0"/>
+                <w:sz w:val="17"/>
+              </w:rPr>
+              <w:t>PP-OCRv6、GGUF</w:t>
+            </w:r>
+          </w:p>
+        </w:tc>
+      </w:tr>
+    </w:tbl>
+    <w:p>
+      <w:pPr>
+        <w:spacing w:after="0"/>
+      </w:pPr>
     </w:p>
     <w:p>
       <w:pPr>
@@ -760,11 +1733,6 @@
       </w:r>
     </w:p>
     <w:p>
-      <w:r>
-        <w:br w:type="page"/>
-      </w:r>
-    </w:p>
-    <w:p>
       <w:pPr>
         <w:spacing w:before="200" w:after="120"/>
       </w:pPr>
@@ -865,6 +1833,49 @@
           <w:sz w:val="21"/>
         </w:rPr>
         <w:t>5.6 本地模型：设置 → OCR 下载检测/识别模型；模型管理导入 .gguf 翻译模型，导入后复制到应用沙箱。</w:t>
+      </w:r>
+    </w:p>
+    <w:p>
+      <w:pPr>
+        <w:spacing w:before="120" w:after="80"/>
+      </w:pPr>
+      <w:r>
+        <w:rPr>
+          <w:rFonts w:ascii="黑体" w:hAnsi="黑体" w:eastAsia="黑体"/>
+          <w:b/>
+          <w:sz w:val="24"/>
+        </w:rPr>
+        <w:t>5.1 翻译流程与预期结果</w:t>
+      </w:r>
+    </w:p>
+    <w:p>
+      <w:pPr>
+        <w:spacing w:line="360" w:lineRule="auto" w:after="80"/>
+        <w:ind w:firstLine="420"/>
+        <w:jc w:val="both"/>
+      </w:pPr>
+      <w:r>
+        <w:rPr>
+          <w:rFonts w:ascii="宋体" w:hAnsi="宋体" w:eastAsia="宋体"/>
+          <w:b w:val="0"/>
+          <w:sz w:val="21"/>
+        </w:rPr>
+        <w:t>点击“翻译本页”后，页面先显示“解码页面”，随后进入“识别文字”；OCR 完成后按行显示“翻译 x/y 行”，最后显示“保存”。成功后原文位置出现译文覆盖层，失败行保留原文。</w:t>
+      </w:r>
+    </w:p>
+    <w:p>
+      <w:pPr>
+        <w:spacing w:line="360" w:lineRule="auto" w:after="80"/>
+        <w:ind w:firstLine="420"/>
+        <w:jc w:val="both"/>
+      </w:pPr>
+      <w:r>
+        <w:rPr>
+          <w:rFonts w:ascii="宋体" w:hAnsi="宋体" w:eastAsia="宋体"/>
+          <w:b w:val="0"/>
+          <w:sz w:val="21"/>
+        </w:rPr>
+        <w:t>翻译过程中可继续翻页；批量翻译在后台按页执行，进度面板显示当前页阶段。取消或退出页面时，已完成页的翻译结果仍会保存。</w:t>
       </w:r>
     </w:p>
     <w:p>
@@ -921,11 +1932,6 @@
       </w:r>
     </w:p>
     <w:p>
-      <w:r>
-        <w:br w:type="page"/>
-      </w:r>
-    </w:p>
-    <w:p>
       <w:pPr>
         <w:spacing w:before="200" w:after="120"/>
       </w:pPr>
@@ -981,6 +1987,291 @@
           <w:sz w:val="21"/>
         </w:rPr>
         <w:t>阅读器背景、亮度、字体大小、行距、横竖排和阅读方向均可独立设置，并保存在本机。</w:t>
+      </w:r>
+    </w:p>
+    <w:p>
+      <w:pPr>
+        <w:spacing w:before="120" w:after="80"/>
+      </w:pPr>
+      <w:r>
+        <w:rPr>
+          <w:rFonts w:ascii="黑体" w:hAnsi="黑体" w:eastAsia="黑体"/>
+          <w:b/>
+          <w:sz w:val="24"/>
+        </w:rPr>
+        <w:t>6.1 断点与布局</w:t>
+      </w:r>
+    </w:p>
+    <w:tbl>
+      <w:tblPr>
+        <w:tblStyle w:val="TableGrid"/>
+        <w:tblW w:type="auto" w:w="0"/>
+        <w:tblLayout w:type="autofit"/>
+        <w:tblLook w:firstColumn="1" w:firstRow="1" w:lastColumn="0" w:lastRow="0" w:noHBand="0" w:noVBand="1" w:val="04A0"/>
+      </w:tblPr>
+      <w:tblGrid>
+        <w:gridCol w:w="3213"/>
+        <w:gridCol w:w="3213"/>
+        <w:gridCol w:w="3213"/>
+      </w:tblGrid>
+      <w:tr>
+        <w:tc>
+          <w:tcPr>
+            <w:tcW w:type="dxa" w:w="3213"/>
+            <w:shd w:fill="E8EEF7"/>
+          </w:tcPr>
+          <w:p>
+            <w:pPr>
+              <w:jc w:val="center"/>
+            </w:pPr>
+            <w:r/>
+            <w:r>
+              <w:rPr>
+                <w:rFonts w:ascii="黑体" w:hAnsi="黑体" w:eastAsia="黑体"/>
+                <w:b/>
+                <w:sz w:val="18"/>
+              </w:rPr>
+              <w:t>断点</w:t>
+            </w:r>
+          </w:p>
+        </w:tc>
+        <w:tc>
+          <w:tcPr>
+            <w:tcW w:type="dxa" w:w="3213"/>
+            <w:shd w:fill="E8EEF7"/>
+          </w:tcPr>
+          <w:p>
+            <w:pPr>
+              <w:jc w:val="center"/>
+            </w:pPr>
+            <w:r/>
+            <w:r>
+              <w:rPr>
+                <w:rFonts w:ascii="黑体" w:hAnsi="黑体" w:eastAsia="黑体"/>
+                <w:b/>
+                <w:sz w:val="18"/>
+              </w:rPr>
+              <w:t>宽度</w:t>
+            </w:r>
+          </w:p>
+        </w:tc>
+        <w:tc>
+          <w:tcPr>
+            <w:tcW w:type="dxa" w:w="3213"/>
+            <w:shd w:fill="E8EEF7"/>
+          </w:tcPr>
+          <w:p>
+            <w:pPr>
+              <w:jc w:val="center"/>
+            </w:pPr>
+            <w:r/>
+            <w:r>
+              <w:rPr>
+                <w:rFonts w:ascii="黑体" w:hAnsi="黑体" w:eastAsia="黑体"/>
+                <w:b/>
+                <w:sz w:val="18"/>
+              </w:rPr>
+              <w:t>布局</w:t>
+            </w:r>
+          </w:p>
+        </w:tc>
+      </w:tr>
+      <w:tr>
+        <w:tc>
+          <w:tcPr>
+            <w:tcW w:type="dxa" w:w="3213"/>
+          </w:tcPr>
+          <w:p>
+            <w:pPr>
+              <w:spacing w:after="40"/>
+            </w:pPr>
+            <w:r/>
+            <w:r>
+              <w:rPr>
+                <w:rFonts w:ascii="宋体" w:hAnsi="宋体" w:eastAsia="宋体"/>
+                <w:b w:val="0"/>
+                <w:sz w:val="17"/>
+              </w:rPr>
+              <w:t>sm</w:t>
+            </w:r>
+          </w:p>
+        </w:tc>
+        <w:tc>
+          <w:tcPr>
+            <w:tcW w:type="dxa" w:w="3213"/>
+          </w:tcPr>
+          <w:p>
+            <w:pPr>
+              <w:spacing w:after="40"/>
+            </w:pPr>
+            <w:r/>
+            <w:r>
+              <w:rPr>
+                <w:rFonts w:ascii="宋体" w:hAnsi="宋体" w:eastAsia="宋体"/>
+                <w:b w:val="0"/>
+                <w:sz w:val="17"/>
+              </w:rPr>
+              <w:t>小于 600vp</w:t>
+            </w:r>
+          </w:p>
+        </w:tc>
+        <w:tc>
+          <w:tcPr>
+            <w:tcW w:type="dxa" w:w="3213"/>
+          </w:tcPr>
+          <w:p>
+            <w:pPr>
+              <w:spacing w:after="40"/>
+            </w:pPr>
+            <w:r/>
+            <w:r>
+              <w:rPr>
+                <w:rFonts w:ascii="宋体" w:hAnsi="宋体" w:eastAsia="宋体"/>
+                <w:b w:val="0"/>
+                <w:sz w:val="17"/>
+              </w:rPr>
+              <w:t>手机底部标签栏，单列</w:t>
+            </w:r>
+          </w:p>
+        </w:tc>
+      </w:tr>
+      <w:tr>
+        <w:tc>
+          <w:tcPr>
+            <w:tcW w:type="dxa" w:w="3213"/>
+          </w:tcPr>
+          <w:p>
+            <w:pPr>
+              <w:spacing w:after="40"/>
+            </w:pPr>
+            <w:r/>
+            <w:r>
+              <w:rPr>
+                <w:rFonts w:ascii="宋体" w:hAnsi="宋体" w:eastAsia="宋体"/>
+                <w:b w:val="0"/>
+                <w:sz w:val="17"/>
+              </w:rPr>
+              <w:t>md</w:t>
+            </w:r>
+          </w:p>
+        </w:tc>
+        <w:tc>
+          <w:tcPr>
+            <w:tcW w:type="dxa" w:w="3213"/>
+          </w:tcPr>
+          <w:p>
+            <w:pPr>
+              <w:spacing w:after="40"/>
+            </w:pPr>
+            <w:r/>
+            <w:r>
+              <w:rPr>
+                <w:rFonts w:ascii="宋体" w:hAnsi="宋体" w:eastAsia="宋体"/>
+                <w:b w:val="0"/>
+                <w:sz w:val="17"/>
+              </w:rPr>
+              <w:t>600–839vp</w:t>
+            </w:r>
+          </w:p>
+        </w:tc>
+        <w:tc>
+          <w:tcPr>
+            <w:tcW w:type="dxa" w:w="3213"/>
+          </w:tcPr>
+          <w:p>
+            <w:pPr>
+              <w:spacing w:after="40"/>
+            </w:pPr>
+            <w:r/>
+            <w:r>
+              <w:rPr>
+                <w:rFonts w:ascii="宋体" w:hAnsi="宋体" w:eastAsia="宋体"/>
+                <w:b w:val="0"/>
+                <w:sz w:val="17"/>
+              </w:rPr>
+              <w:t>平板/折叠屏，左侧导航轨</w:t>
+            </w:r>
+          </w:p>
+        </w:tc>
+      </w:tr>
+      <w:tr>
+        <w:tc>
+          <w:tcPr>
+            <w:tcW w:type="dxa" w:w="3213"/>
+          </w:tcPr>
+          <w:p>
+            <w:pPr>
+              <w:spacing w:after="40"/>
+            </w:pPr>
+            <w:r/>
+            <w:r>
+              <w:rPr>
+                <w:rFonts w:ascii="宋体" w:hAnsi="宋体" w:eastAsia="宋体"/>
+                <w:b w:val="0"/>
+                <w:sz w:val="17"/>
+              </w:rPr>
+              <w:t>lg</w:t>
+            </w:r>
+          </w:p>
+        </w:tc>
+        <w:tc>
+          <w:tcPr>
+            <w:tcW w:type="dxa" w:w="3213"/>
+          </w:tcPr>
+          <w:p>
+            <w:pPr>
+              <w:spacing w:after="40"/>
+            </w:pPr>
+            <w:r/>
+            <w:r>
+              <w:rPr>
+                <w:rFonts w:ascii="宋体" w:hAnsi="宋体" w:eastAsia="宋体"/>
+                <w:b w:val="0"/>
+                <w:sz w:val="17"/>
+              </w:rPr>
+              <w:t>840vp 及以上</w:t>
+            </w:r>
+          </w:p>
+        </w:tc>
+        <w:tc>
+          <w:tcPr>
+            <w:tcW w:type="dxa" w:w="3213"/>
+          </w:tcPr>
+          <w:p>
+            <w:pPr>
+              <w:spacing w:after="40"/>
+            </w:pPr>
+            <w:r/>
+            <w:r>
+              <w:rPr>
+                <w:rFonts w:ascii="宋体" w:hAnsi="宋体" w:eastAsia="宋体"/>
+                <w:b w:val="0"/>
+                <w:sz w:val="17"/>
+              </w:rPr>
+              <w:t>宽屏双列/双页，阅读器可并排</w:t>
+            </w:r>
+          </w:p>
+        </w:tc>
+      </w:tr>
+    </w:tbl>
+    <w:p>
+      <w:pPr>
+        <w:spacing w:after="0"/>
+      </w:pPr>
+    </w:p>
+    <w:p>
+      <w:pPr>
+        <w:spacing w:line="360" w:lineRule="auto" w:after="80"/>
+        <w:ind w:firstLine="420"/>
+        <w:jc w:val="both"/>
+      </w:pPr>
+      <w:r>
+        <w:rPr>
+          <w:rFonts w:ascii="宋体" w:hAnsi="宋体" w:eastAsia="宋体"/>
+          <w:b w:val="0"/>
+          <w:sz w:val="21"/>
+        </w:rPr>
+        <w:t>阅读器在宽屏下自动计算双页插槽；旋转屏幕或改变窗口大小时，重新计算页面尺寸和覆盖层坐标，保持译文与原文对齐。</w:t>
       </w:r>
     </w:p>
     <w:p>
@@ -1037,11 +2328,6 @@
       </w:r>
     </w:p>
     <w:p>
-      <w:r>
-        <w:br w:type="page"/>
-      </w:r>
-    </w:p>
-    <w:p>
       <w:pPr>
         <w:spacing w:before="200" w:after="120"/>
       </w:pPr>
@@ -1112,6 +2398,350 @@
           <w:sz w:val="21"/>
         </w:rPr>
         <w:t>模型文件不随安装包分发；用户自行下载或导入，模型许可由模型发布方决定。</w:t>
+      </w:r>
+    </w:p>
+    <w:p>
+      <w:pPr>
+        <w:spacing w:before="120" w:after="80"/>
+      </w:pPr>
+      <w:r>
+        <w:rPr>
+          <w:rFonts w:ascii="黑体" w:hAnsi="黑体" w:eastAsia="黑体"/>
+          <w:b/>
+          <w:sz w:val="24"/>
+        </w:rPr>
+        <w:t>7.1 性能与资源</w:t>
+      </w:r>
+    </w:p>
+    <w:tbl>
+      <w:tblPr>
+        <w:tblStyle w:val="TableGrid"/>
+        <w:tblW w:type="auto" w:w="0"/>
+        <w:tblLayout w:type="autofit"/>
+        <w:tblLook w:firstColumn="1" w:firstRow="1" w:lastColumn="0" w:lastRow="0" w:noHBand="0" w:noVBand="1" w:val="04A0"/>
+      </w:tblPr>
+      <w:tblGrid>
+        <w:gridCol w:w="3213"/>
+        <w:gridCol w:w="3213"/>
+        <w:gridCol w:w="3213"/>
+      </w:tblGrid>
+      <w:tr>
+        <w:tc>
+          <w:tcPr>
+            <w:tcW w:type="dxa" w:w="3213"/>
+            <w:shd w:fill="E8EEF7"/>
+          </w:tcPr>
+          <w:p>
+            <w:pPr>
+              <w:jc w:val="center"/>
+            </w:pPr>
+            <w:r/>
+            <w:r>
+              <w:rPr>
+                <w:rFonts w:ascii="黑体" w:hAnsi="黑体" w:eastAsia="黑体"/>
+                <w:b/>
+                <w:sz w:val="18"/>
+              </w:rPr>
+              <w:t>场景</w:t>
+            </w:r>
+          </w:p>
+        </w:tc>
+        <w:tc>
+          <w:tcPr>
+            <w:tcW w:type="dxa" w:w="3213"/>
+            <w:shd w:fill="E8EEF7"/>
+          </w:tcPr>
+          <w:p>
+            <w:pPr>
+              <w:jc w:val="center"/>
+            </w:pPr>
+            <w:r/>
+            <w:r>
+              <w:rPr>
+                <w:rFonts w:ascii="黑体" w:hAnsi="黑体" w:eastAsia="黑体"/>
+                <w:b/>
+                <w:sz w:val="18"/>
+              </w:rPr>
+              <w:t>实测/估算</w:t>
+            </w:r>
+          </w:p>
+        </w:tc>
+        <w:tc>
+          <w:tcPr>
+            <w:tcW w:type="dxa" w:w="3213"/>
+            <w:shd w:fill="E8EEF7"/>
+          </w:tcPr>
+          <w:p>
+            <w:pPr>
+              <w:jc w:val="center"/>
+            </w:pPr>
+            <w:r/>
+            <w:r>
+              <w:rPr>
+                <w:rFonts w:ascii="黑体" w:hAnsi="黑体" w:eastAsia="黑体"/>
+                <w:b/>
+                <w:sz w:val="18"/>
+              </w:rPr>
+              <w:t>说明</w:t>
+            </w:r>
+          </w:p>
+        </w:tc>
+      </w:tr>
+      <w:tr>
+        <w:tc>
+          <w:tcPr>
+            <w:tcW w:type="dxa" w:w="3213"/>
+          </w:tcPr>
+          <w:p>
+            <w:pPr>
+              <w:spacing w:after="40"/>
+            </w:pPr>
+            <w:r/>
+            <w:r>
+              <w:rPr>
+                <w:rFonts w:ascii="宋体" w:hAnsi="宋体" w:eastAsia="宋体"/>
+                <w:b w:val="0"/>
+                <w:sz w:val="17"/>
+              </w:rPr>
+              <w:t>原生 OCR 6 行</w:t>
+            </w:r>
+          </w:p>
+        </w:tc>
+        <w:tc>
+          <w:tcPr>
+            <w:tcW w:type="dxa" w:w="3213"/>
+          </w:tcPr>
+          <w:p>
+            <w:pPr>
+              <w:spacing w:after="40"/>
+            </w:pPr>
+            <w:r/>
+            <w:r>
+              <w:rPr>
+                <w:rFonts w:ascii="宋体" w:hAnsi="宋体" w:eastAsia="宋体"/>
+                <w:b w:val="0"/>
+                <w:sz w:val="17"/>
+              </w:rPr>
+              <w:t>约 594ms</w:t>
+            </w:r>
+          </w:p>
+        </w:tc>
+        <w:tc>
+          <w:tcPr>
+            <w:tcW w:type="dxa" w:w="3213"/>
+          </w:tcPr>
+          <w:p>
+            <w:pPr>
+              <w:spacing w:after="40"/>
+            </w:pPr>
+            <w:r/>
+            <w:r>
+              <w:rPr>
+                <w:rFonts w:ascii="宋体" w:hAnsi="宋体" w:eastAsia="宋体"/>
+                <w:b w:val="0"/>
+                <w:sz w:val="17"/>
+              </w:rPr>
+              <w:t>Mate 90 Pro 模拟器</w:t>
+            </w:r>
+          </w:p>
+        </w:tc>
+      </w:tr>
+      <w:tr>
+        <w:tc>
+          <w:tcPr>
+            <w:tcW w:type="dxa" w:w="3213"/>
+          </w:tcPr>
+          <w:p>
+            <w:pPr>
+              <w:spacing w:after="40"/>
+            </w:pPr>
+            <w:r/>
+            <w:r>
+              <w:rPr>
+                <w:rFonts w:ascii="宋体" w:hAnsi="宋体" w:eastAsia="宋体"/>
+                <w:b w:val="0"/>
+                <w:sz w:val="17"/>
+              </w:rPr>
+              <w:t>本地翻译 6 行</w:t>
+            </w:r>
+          </w:p>
+        </w:tc>
+        <w:tc>
+          <w:tcPr>
+            <w:tcW w:type="dxa" w:w="3213"/>
+          </w:tcPr>
+          <w:p>
+            <w:pPr>
+              <w:spacing w:after="40"/>
+            </w:pPr>
+            <w:r/>
+            <w:r>
+              <w:rPr>
+                <w:rFonts w:ascii="宋体" w:hAnsi="宋体" w:eastAsia="宋体"/>
+                <w:b w:val="0"/>
+                <w:sz w:val="17"/>
+              </w:rPr>
+              <w:t>约 1.4s</w:t>
+            </w:r>
+          </w:p>
+        </w:tc>
+        <w:tc>
+          <w:tcPr>
+            <w:tcW w:type="dxa" w:w="3213"/>
+          </w:tcPr>
+          <w:p>
+            <w:pPr>
+              <w:spacing w:after="40"/>
+            </w:pPr>
+            <w:r/>
+            <w:r>
+              <w:rPr>
+                <w:rFonts w:ascii="宋体" w:hAnsi="宋体" w:eastAsia="宋体"/>
+                <w:b w:val="0"/>
+                <w:sz w:val="17"/>
+              </w:rPr>
+              <w:t>随模型/设备变化</w:t>
+            </w:r>
+          </w:p>
+        </w:tc>
+      </w:tr>
+      <w:tr>
+        <w:tc>
+          <w:tcPr>
+            <w:tcW w:type="dxa" w:w="3213"/>
+          </w:tcPr>
+          <w:p>
+            <w:pPr>
+              <w:spacing w:after="40"/>
+            </w:pPr>
+            <w:r/>
+            <w:r>
+              <w:rPr>
+                <w:rFonts w:ascii="宋体" w:hAnsi="宋体" w:eastAsia="宋体"/>
+                <w:b w:val="0"/>
+                <w:sz w:val="17"/>
+              </w:rPr>
+              <w:t>整页合计</w:t>
+            </w:r>
+          </w:p>
+        </w:tc>
+        <w:tc>
+          <w:tcPr>
+            <w:tcW w:type="dxa" w:w="3213"/>
+          </w:tcPr>
+          <w:p>
+            <w:pPr>
+              <w:spacing w:after="40"/>
+            </w:pPr>
+            <w:r/>
+            <w:r>
+              <w:rPr>
+                <w:rFonts w:ascii="宋体" w:hAnsi="宋体" w:eastAsia="宋体"/>
+                <w:b w:val="0"/>
+                <w:sz w:val="17"/>
+              </w:rPr>
+              <w:t>约 2.1s</w:t>
+            </w:r>
+          </w:p>
+        </w:tc>
+        <w:tc>
+          <w:tcPr>
+            <w:tcW w:type="dxa" w:w="3213"/>
+          </w:tcPr>
+          <w:p>
+            <w:pPr>
+              <w:spacing w:after="40"/>
+            </w:pPr>
+            <w:r/>
+            <w:r>
+              <w:rPr>
+                <w:rFonts w:ascii="宋体" w:hAnsi="宋体" w:eastAsia="宋体"/>
+                <w:b w:val="0"/>
+                <w:sz w:val="17"/>
+              </w:rPr>
+              <w:t>模拟器合成页</w:t>
+            </w:r>
+          </w:p>
+        </w:tc>
+      </w:tr>
+      <w:tr>
+        <w:tc>
+          <w:tcPr>
+            <w:tcW w:type="dxa" w:w="3213"/>
+          </w:tcPr>
+          <w:p>
+            <w:pPr>
+              <w:spacing w:after="40"/>
+            </w:pPr>
+            <w:r/>
+            <w:r>
+              <w:rPr>
+                <w:rFonts w:ascii="宋体" w:hAnsi="宋体" w:eastAsia="宋体"/>
+                <w:b w:val="0"/>
+                <w:sz w:val="17"/>
+              </w:rPr>
+              <w:t>安装包</w:t>
+            </w:r>
+          </w:p>
+        </w:tc>
+        <w:tc>
+          <w:tcPr>
+            <w:tcW w:type="dxa" w:w="3213"/>
+          </w:tcPr>
+          <w:p>
+            <w:pPr>
+              <w:spacing w:after="40"/>
+            </w:pPr>
+            <w:r/>
+            <w:r>
+              <w:rPr>
+                <w:rFonts w:ascii="宋体" w:hAnsi="宋体" w:eastAsia="宋体"/>
+                <w:b w:val="0"/>
+                <w:sz w:val="17"/>
+              </w:rPr>
+              <w:t>约 93MB</w:t>
+            </w:r>
+          </w:p>
+        </w:tc>
+        <w:tc>
+          <w:tcPr>
+            <w:tcW w:type="dxa" w:w="3213"/>
+          </w:tcPr>
+          <w:p>
+            <w:pPr>
+              <w:spacing w:after="40"/>
+            </w:pPr>
+            <w:r/>
+            <w:r>
+              <w:rPr>
+                <w:rFonts w:ascii="宋体" w:hAnsi="宋体" w:eastAsia="宋体"/>
+                <w:b w:val="0"/>
+                <w:sz w:val="17"/>
+              </w:rPr>
+              <w:t>含字体与原生库</w:t>
+            </w:r>
+          </w:p>
+        </w:tc>
+      </w:tr>
+    </w:tbl>
+    <w:p>
+      <w:pPr>
+        <w:spacing w:after="0"/>
+      </w:pPr>
+    </w:p>
+    <w:p>
+      <w:pPr>
+        <w:spacing w:line="360" w:lineRule="auto" w:after="80"/>
+        <w:ind w:firstLine="420"/>
+        <w:jc w:val="both"/>
+      </w:pPr>
+      <w:r>
+        <w:rPr>
+          <w:rFonts w:ascii="宋体" w:hAnsi="宋体" w:eastAsia="宋体"/>
+          <w:b w:val="0"/>
+          <w:sz w:val="21"/>
+        </w:rPr>
+        <w:t>本地 OCR 的 det 长边限制为 768，减少大图计算量；原生 det/rec 在 TaskPool 中执行，主线程只负责图片解码和界面刷新。</w:t>
       </w:r>
     </w:p>
     <w:p>
@@ -1168,11 +2798,6 @@
       </w:r>
     </w:p>
     <w:p>
-      <w:r>
-        <w:br w:type="page"/>
-      </w:r>
-    </w:p>
-    <w:p>
       <w:pPr>
         <w:spacing w:before="200" w:after="120"/>
       </w:pPr>
@@ -1246,8 +2871,46 @@
       </w:r>
     </w:p>
     <w:p>
+      <w:pPr>
+        <w:spacing w:before="120" w:after="80"/>
+      </w:pPr>
       <w:r>
-        <w:br w:type="page"/>
+        <w:rPr>
+          <w:rFonts w:ascii="黑体" w:hAnsi="黑体" w:eastAsia="黑体"/>
+          <w:b/>
+          <w:sz w:val="24"/>
+        </w:rPr>
+        <w:t>8.1 数据流</w:t>
+      </w:r>
+    </w:p>
+    <w:p>
+      <w:pPr>
+        <w:spacing w:line="360" w:lineRule="auto" w:after="80"/>
+        <w:ind w:firstLine="420"/>
+        <w:jc w:val="both"/>
+      </w:pPr>
+      <w:r>
+        <w:rPr>
+          <w:rFonts w:ascii="宋体" w:hAnsi="宋体" w:eastAsia="宋体"/>
+          <w:b w:val="0"/>
+          <w:sz w:val="21"/>
+        </w:rPr>
+        <w:t>本地模式：图片/文本只在设备内处理；在线模式：只把待翻译文本发送到用户选择的翻译服务商，不上传整本漫画。API Key 保存在应用沙箱，不写入日志。</w:t>
+      </w:r>
+    </w:p>
+    <w:p>
+      <w:pPr>
+        <w:spacing w:line="360" w:lineRule="auto" w:after="80"/>
+        <w:ind w:firstLine="420"/>
+        <w:jc w:val="both"/>
+      </w:pPr>
+      <w:r>
+        <w:rPr>
+          <w:rFonts w:ascii="宋体" w:hAnsi="宋体" w:eastAsia="宋体"/>
+          <w:b w:val="0"/>
+          <w:sz w:val="21"/>
+        </w:rPr>
+        <w:t>清理缓存会删除去字底图、临时合成图和导出暂存；卸载应用会删除应用沙箱中的书籍、翻译、术语表与偏好。</w:t>
       </w:r>
     </w:p>
     <w:p>
@@ -1339,9 +3002,392 @@
       </w:r>
     </w:p>
     <w:p>
+      <w:pPr>
+        <w:spacing w:before="120" w:after="80"/>
+      </w:pPr>
       <w:r>
-        <w:br w:type="page"/>
+        <w:rPr>
+          <w:rFonts w:ascii="黑体" w:hAnsi="黑体" w:eastAsia="黑体"/>
+          <w:b/>
+          <w:sz w:val="24"/>
+        </w:rPr>
+        <w:t>9.1 故障处理表</w:t>
       </w:r>
+    </w:p>
+    <w:tbl>
+      <w:tblPr>
+        <w:tblStyle w:val="TableGrid"/>
+        <w:tblW w:type="auto" w:w="0"/>
+        <w:tblLayout w:type="autofit"/>
+        <w:tblLook w:firstColumn="1" w:firstRow="1" w:lastColumn="0" w:lastRow="0" w:noHBand="0" w:noVBand="1" w:val="04A0"/>
+      </w:tblPr>
+      <w:tblGrid>
+        <w:gridCol w:w="3213"/>
+        <w:gridCol w:w="3213"/>
+        <w:gridCol w:w="3213"/>
+      </w:tblGrid>
+      <w:tr>
+        <w:tc>
+          <w:tcPr>
+            <w:tcW w:type="dxa" w:w="3213"/>
+            <w:shd w:fill="E8EEF7"/>
+          </w:tcPr>
+          <w:p>
+            <w:pPr>
+              <w:jc w:val="center"/>
+            </w:pPr>
+            <w:r/>
+            <w:r>
+              <w:rPr>
+                <w:rFonts w:ascii="黑体" w:hAnsi="黑体" w:eastAsia="黑体"/>
+                <w:b/>
+                <w:sz w:val="18"/>
+              </w:rPr>
+              <w:t>现象</w:t>
+            </w:r>
+          </w:p>
+        </w:tc>
+        <w:tc>
+          <w:tcPr>
+            <w:tcW w:type="dxa" w:w="3213"/>
+            <w:shd w:fill="E8EEF7"/>
+          </w:tcPr>
+          <w:p>
+            <w:pPr>
+              <w:jc w:val="center"/>
+            </w:pPr>
+            <w:r/>
+            <w:r>
+              <w:rPr>
+                <w:rFonts w:ascii="黑体" w:hAnsi="黑体" w:eastAsia="黑体"/>
+                <w:b/>
+                <w:sz w:val="18"/>
+              </w:rPr>
+              <w:t>可能原因</w:t>
+            </w:r>
+          </w:p>
+        </w:tc>
+        <w:tc>
+          <w:tcPr>
+            <w:tcW w:type="dxa" w:w="3213"/>
+            <w:shd w:fill="E8EEF7"/>
+          </w:tcPr>
+          <w:p>
+            <w:pPr>
+              <w:jc w:val="center"/>
+            </w:pPr>
+            <w:r/>
+            <w:r>
+              <w:rPr>
+                <w:rFonts w:ascii="黑体" w:hAnsi="黑体" w:eastAsia="黑体"/>
+                <w:b/>
+                <w:sz w:val="18"/>
+              </w:rPr>
+              <w:t>处理</w:t>
+            </w:r>
+          </w:p>
+        </w:tc>
+      </w:tr>
+      <w:tr>
+        <w:tc>
+          <w:tcPr>
+            <w:tcW w:type="dxa" w:w="3213"/>
+          </w:tcPr>
+          <w:p>
+            <w:pPr>
+              <w:spacing w:after="40"/>
+            </w:pPr>
+            <w:r/>
+            <w:r>
+              <w:rPr>
+                <w:rFonts w:ascii="宋体" w:hAnsi="宋体" w:eastAsia="宋体"/>
+                <w:b w:val="0"/>
+                <w:sz w:val="17"/>
+              </w:rPr>
+              <w:t>图片加载失败</w:t>
+            </w:r>
+          </w:p>
+        </w:tc>
+        <w:tc>
+          <w:tcPr>
+            <w:tcW w:type="dxa" w:w="3213"/>
+          </w:tcPr>
+          <w:p>
+            <w:pPr>
+              <w:spacing w:after="40"/>
+            </w:pPr>
+            <w:r/>
+            <w:r>
+              <w:rPr>
+                <w:rFonts w:ascii="宋体" w:hAnsi="宋体" w:eastAsia="宋体"/>
+                <w:b w:val="0"/>
+                <w:sz w:val="17"/>
+              </w:rPr>
+              <w:t>文件被移动/删除</w:t>
+            </w:r>
+          </w:p>
+        </w:tc>
+        <w:tc>
+          <w:tcPr>
+            <w:tcW w:type="dxa" w:w="3213"/>
+          </w:tcPr>
+          <w:p>
+            <w:pPr>
+              <w:spacing w:after="40"/>
+            </w:pPr>
+            <w:r/>
+            <w:r>
+              <w:rPr>
+                <w:rFonts w:ascii="宋体" w:hAnsi="宋体" w:eastAsia="宋体"/>
+                <w:b w:val="0"/>
+                <w:sz w:val="17"/>
+              </w:rPr>
+              <w:t>重新导入</w:t>
+            </w:r>
+          </w:p>
+        </w:tc>
+      </w:tr>
+      <w:tr>
+        <w:tc>
+          <w:tcPr>
+            <w:tcW w:type="dxa" w:w="3213"/>
+          </w:tcPr>
+          <w:p>
+            <w:pPr>
+              <w:spacing w:after="40"/>
+            </w:pPr>
+            <w:r/>
+            <w:r>
+              <w:rPr>
+                <w:rFonts w:ascii="宋体" w:hAnsi="宋体" w:eastAsia="宋体"/>
+                <w:b w:val="0"/>
+                <w:sz w:val="17"/>
+              </w:rPr>
+              <w:t>OCR 无结果</w:t>
+            </w:r>
+          </w:p>
+        </w:tc>
+        <w:tc>
+          <w:tcPr>
+            <w:tcW w:type="dxa" w:w="3213"/>
+          </w:tcPr>
+          <w:p>
+            <w:pPr>
+              <w:spacing w:after="40"/>
+            </w:pPr>
+            <w:r/>
+            <w:r>
+              <w:rPr>
+                <w:rFonts w:ascii="宋体" w:hAnsi="宋体" w:eastAsia="宋体"/>
+                <w:b w:val="0"/>
+                <w:sz w:val="17"/>
+              </w:rPr>
+              <w:t>模型未下载/图片过小</w:t>
+            </w:r>
+          </w:p>
+        </w:tc>
+        <w:tc>
+          <w:tcPr>
+            <w:tcW w:type="dxa" w:w="3213"/>
+          </w:tcPr>
+          <w:p>
+            <w:pPr>
+              <w:spacing w:after="40"/>
+            </w:pPr>
+            <w:r/>
+            <w:r>
+              <w:rPr>
+                <w:rFonts w:ascii="宋体" w:hAnsi="宋体" w:eastAsia="宋体"/>
+                <w:b w:val="0"/>
+                <w:sz w:val="17"/>
+              </w:rPr>
+              <w:t>下载模型、换清晰图片</w:t>
+            </w:r>
+          </w:p>
+        </w:tc>
+      </w:tr>
+      <w:tr>
+        <w:tc>
+          <w:tcPr>
+            <w:tcW w:type="dxa" w:w="3213"/>
+          </w:tcPr>
+          <w:p>
+            <w:pPr>
+              <w:spacing w:after="40"/>
+            </w:pPr>
+            <w:r/>
+            <w:r>
+              <w:rPr>
+                <w:rFonts w:ascii="宋体" w:hAnsi="宋体" w:eastAsia="宋体"/>
+                <w:b w:val="0"/>
+                <w:sz w:val="17"/>
+              </w:rPr>
+              <w:t>翻译失败</w:t>
+            </w:r>
+          </w:p>
+        </w:tc>
+        <w:tc>
+          <w:tcPr>
+            <w:tcW w:type="dxa" w:w="3213"/>
+          </w:tcPr>
+          <w:p>
+            <w:pPr>
+              <w:spacing w:after="40"/>
+            </w:pPr>
+            <w:r/>
+            <w:r>
+              <w:rPr>
+                <w:rFonts w:ascii="宋体" w:hAnsi="宋体" w:eastAsia="宋体"/>
+                <w:b w:val="0"/>
+                <w:sz w:val="17"/>
+              </w:rPr>
+              <w:t>网络/Key/模型路径</w:t>
+            </w:r>
+          </w:p>
+        </w:tc>
+        <w:tc>
+          <w:tcPr>
+            <w:tcW w:type="dxa" w:w="3213"/>
+          </w:tcPr>
+          <w:p>
+            <w:pPr>
+              <w:spacing w:after="40"/>
+            </w:pPr>
+            <w:r/>
+            <w:r>
+              <w:rPr>
+                <w:rFonts w:ascii="宋体" w:hAnsi="宋体" w:eastAsia="宋体"/>
+                <w:b w:val="0"/>
+                <w:sz w:val="17"/>
+              </w:rPr>
+              <w:t>检查网络与配置</w:t>
+            </w:r>
+          </w:p>
+        </w:tc>
+      </w:tr>
+      <w:tr>
+        <w:tc>
+          <w:tcPr>
+            <w:tcW w:type="dxa" w:w="3213"/>
+          </w:tcPr>
+          <w:p>
+            <w:pPr>
+              <w:spacing w:after="40"/>
+            </w:pPr>
+            <w:r/>
+            <w:r>
+              <w:rPr>
+                <w:rFonts w:ascii="宋体" w:hAnsi="宋体" w:eastAsia="宋体"/>
+                <w:b w:val="0"/>
+                <w:sz w:val="17"/>
+              </w:rPr>
+              <w:t>PDF 导出失败</w:t>
+            </w:r>
+          </w:p>
+        </w:tc>
+        <w:tc>
+          <w:tcPr>
+            <w:tcW w:type="dxa" w:w="3213"/>
+          </w:tcPr>
+          <w:p>
+            <w:pPr>
+              <w:spacing w:after="40"/>
+            </w:pPr>
+            <w:r/>
+            <w:r>
+              <w:rPr>
+                <w:rFonts w:ascii="宋体" w:hAnsi="宋体" w:eastAsia="宋体"/>
+                <w:b w:val="0"/>
+                <w:sz w:val="17"/>
+              </w:rPr>
+              <w:t>PDF Kit 不可用/无写权限</w:t>
+            </w:r>
+          </w:p>
+        </w:tc>
+        <w:tc>
+          <w:tcPr>
+            <w:tcW w:type="dxa" w:w="3213"/>
+          </w:tcPr>
+          <w:p>
+            <w:pPr>
+              <w:spacing w:after="40"/>
+            </w:pPr>
+            <w:r/>
+            <w:r>
+              <w:rPr>
+                <w:rFonts w:ascii="宋体" w:hAnsi="宋体" w:eastAsia="宋体"/>
+                <w:b w:val="0"/>
+                <w:sz w:val="17"/>
+              </w:rPr>
+              <w:t>改用 ZIP 导出</w:t>
+            </w:r>
+          </w:p>
+        </w:tc>
+      </w:tr>
+      <w:tr>
+        <w:tc>
+          <w:tcPr>
+            <w:tcW w:type="dxa" w:w="3213"/>
+          </w:tcPr>
+          <w:p>
+            <w:pPr>
+              <w:spacing w:after="40"/>
+            </w:pPr>
+            <w:r/>
+            <w:r>
+              <w:rPr>
+                <w:rFonts w:ascii="宋体" w:hAnsi="宋体" w:eastAsia="宋体"/>
+                <w:b w:val="0"/>
+                <w:sz w:val="17"/>
+              </w:rPr>
+              <w:t>模型导入失败</w:t>
+            </w:r>
+          </w:p>
+        </w:tc>
+        <w:tc>
+          <w:tcPr>
+            <w:tcW w:type="dxa" w:w="3213"/>
+          </w:tcPr>
+          <w:p>
+            <w:pPr>
+              <w:spacing w:after="40"/>
+            </w:pPr>
+            <w:r/>
+            <w:r>
+              <w:rPr>
+                <w:rFonts w:ascii="宋体" w:hAnsi="宋体" w:eastAsia="宋体"/>
+                <w:b w:val="0"/>
+                <w:sz w:val="17"/>
+              </w:rPr>
+              <w:t>文件非 GGUF/不完整</w:t>
+            </w:r>
+          </w:p>
+        </w:tc>
+        <w:tc>
+          <w:tcPr>
+            <w:tcW w:type="dxa" w:w="3213"/>
+          </w:tcPr>
+          <w:p>
+            <w:pPr>
+              <w:spacing w:after="40"/>
+            </w:pPr>
+            <w:r/>
+            <w:r>
+              <w:rPr>
+                <w:rFonts w:ascii="宋体" w:hAnsi="宋体" w:eastAsia="宋体"/>
+                <w:b w:val="0"/>
+                <w:sz w:val="17"/>
+              </w:rPr>
+              <w:t>重新下载/导入</w:t>
+            </w:r>
+          </w:p>
+        </w:tc>
+      </w:tr>
+    </w:tbl>
+    <w:p>
+      <w:pPr>
+        <w:spacing w:after="0"/>
+      </w:pPr>
     </w:p>
     <w:p>
       <w:pPr>
@@ -1417,8 +3463,18 @@
       </w:r>
     </w:p>
     <w:p>
+      <w:pPr>
+        <w:spacing w:line="360" w:lineRule="auto" w:after="80"/>
+        <w:ind w:firstLine="420"/>
+        <w:jc w:val="both"/>
+      </w:pPr>
       <w:r>
-        <w:br w:type="page"/>
+        <w:rPr>
+          <w:rFonts w:ascii="宋体" w:hAnsi="宋体" w:eastAsia="宋体"/>
+          <w:b w:val="0"/>
+          <w:sz w:val="21"/>
+        </w:rPr>
+        <w:t>软件名称、版本号、著作权人应与申请表、源程序页眉、说明书封面保持一致；本软件为首次申请，未登记过低版本。</w:t>
       </w:r>
     </w:p>
     <w:p>

</xml_diff>

<commit_message>
docs(softcopyright): reflow manual with LibreOffice and remove large gaps
- compact TOC and remove forced page breaks
- tighten body line spacing and keep table rows together
- remove tall screenshots that caused blank space; keep landscape figures with captions
- rebuild 12-page text-searchable PDF via LibreOffice
- update page counts and PDF hash
</commit_message>
<xml_diff>
--- a/softcopyright/01-软件说明书.docx
+++ b/softcopyright/01-软件说明书.docx
@@ -110,9 +110,7 @@
     </w:p>
     <w:p>
       <w:pPr>
-        <w:spacing w:line="360" w:lineRule="auto" w:after="80"/>
-        <w:ind w:firstLine="420"/>
-        <w:jc w:val="both"/>
+        <w:spacing w:line="240" w:lineRule="auto" w:after="40"/>
       </w:pPr>
       <w:r>
         <w:rPr>
@@ -125,9 +123,7 @@
     </w:p>
     <w:p>
       <w:pPr>
-        <w:spacing w:line="360" w:lineRule="auto" w:after="80"/>
-        <w:ind w:firstLine="420"/>
-        <w:jc w:val="both"/>
+        <w:spacing w:line="240" w:lineRule="auto" w:after="40"/>
       </w:pPr>
       <w:r>
         <w:rPr>
@@ -140,9 +136,7 @@
     </w:p>
     <w:p>
       <w:pPr>
-        <w:spacing w:line="360" w:lineRule="auto" w:after="80"/>
-        <w:ind w:firstLine="420"/>
-        <w:jc w:val="both"/>
+        <w:spacing w:line="240" w:lineRule="auto" w:after="40"/>
       </w:pPr>
       <w:r>
         <w:rPr>
@@ -155,9 +149,7 @@
     </w:p>
     <w:p>
       <w:pPr>
-        <w:spacing w:line="360" w:lineRule="auto" w:after="80"/>
-        <w:ind w:firstLine="420"/>
-        <w:jc w:val="both"/>
+        <w:spacing w:line="240" w:lineRule="auto" w:after="40"/>
       </w:pPr>
       <w:r>
         <w:rPr>
@@ -170,9 +162,7 @@
     </w:p>
     <w:p>
       <w:pPr>
-        <w:spacing w:line="360" w:lineRule="auto" w:after="80"/>
-        <w:ind w:firstLine="420"/>
-        <w:jc w:val="both"/>
+        <w:spacing w:line="240" w:lineRule="auto" w:after="40"/>
       </w:pPr>
       <w:r>
         <w:rPr>
@@ -185,9 +175,7 @@
     </w:p>
     <w:p>
       <w:pPr>
-        <w:spacing w:line="360" w:lineRule="auto" w:after="80"/>
-        <w:ind w:firstLine="420"/>
-        <w:jc w:val="both"/>
+        <w:spacing w:line="240" w:lineRule="auto" w:after="40"/>
       </w:pPr>
       <w:r>
         <w:rPr>
@@ -200,9 +188,7 @@
     </w:p>
     <w:p>
       <w:pPr>
-        <w:spacing w:line="360" w:lineRule="auto" w:after="80"/>
-        <w:ind w:firstLine="420"/>
-        <w:jc w:val="both"/>
+        <w:spacing w:line="240" w:lineRule="auto" w:after="40"/>
       </w:pPr>
       <w:r>
         <w:rPr>
@@ -215,9 +201,7 @@
     </w:p>
     <w:p>
       <w:pPr>
-        <w:spacing w:line="360" w:lineRule="auto" w:after="80"/>
-        <w:ind w:firstLine="420"/>
-        <w:jc w:val="both"/>
+        <w:spacing w:line="240" w:lineRule="auto" w:after="40"/>
       </w:pPr>
       <w:r>
         <w:rPr>
@@ -230,9 +214,7 @@
     </w:p>
     <w:p>
       <w:pPr>
-        <w:spacing w:line="360" w:lineRule="auto" w:after="80"/>
-        <w:ind w:firstLine="420"/>
-        <w:jc w:val="both"/>
+        <w:spacing w:line="240" w:lineRule="auto" w:after="40"/>
       </w:pPr>
       <w:r>
         <w:rPr>
@@ -245,9 +227,7 @@
     </w:p>
     <w:p>
       <w:pPr>
-        <w:spacing w:line="360" w:lineRule="auto" w:after="80"/>
-        <w:ind w:firstLine="420"/>
-        <w:jc w:val="both"/>
+        <w:spacing w:line="240" w:lineRule="auto" w:after="40"/>
       </w:pPr>
       <w:r>
         <w:rPr>
@@ -259,11 +239,6 @@
       </w:r>
     </w:p>
     <w:p>
-      <w:r>
-        <w:br w:type="page"/>
-      </w:r>
-    </w:p>
-    <w:p>
       <w:pPr>
         <w:spacing w:before="200" w:after="120"/>
       </w:pPr>
@@ -278,7 +253,7 @@
     </w:p>
     <w:p>
       <w:pPr>
-        <w:spacing w:line="360" w:lineRule="auto" w:after="80"/>
+        <w:spacing w:line="312" w:lineRule="auto" w:after="60"/>
         <w:ind w:firstLine="420"/>
         <w:jc w:val="both"/>
       </w:pPr>
@@ -293,7 +268,7 @@
     </w:p>
     <w:p>
       <w:pPr>
-        <w:spacing w:line="360" w:lineRule="auto" w:after="80"/>
+        <w:spacing w:line="312" w:lineRule="auto" w:after="60"/>
         <w:ind w:firstLine="420"/>
         <w:jc w:val="both"/>
       </w:pPr>
@@ -308,7 +283,7 @@
     </w:p>
     <w:p>
       <w:pPr>
-        <w:spacing w:line="360" w:lineRule="auto" w:after="80"/>
+        <w:spacing w:line="312" w:lineRule="auto" w:after="60"/>
         <w:ind w:firstLine="420"/>
         <w:jc w:val="both"/>
       </w:pPr>
@@ -336,7 +311,7 @@
     </w:p>
     <w:p>
       <w:pPr>
-        <w:spacing w:line="360" w:lineRule="auto" w:after="80"/>
+        <w:spacing w:line="312" w:lineRule="auto" w:after="60"/>
         <w:ind w:firstLine="420"/>
         <w:jc w:val="both"/>
       </w:pPr>
@@ -364,7 +339,7 @@
     </w:p>
     <w:p>
       <w:pPr>
-        <w:spacing w:line="360" w:lineRule="auto" w:after="80"/>
+        <w:spacing w:line="312" w:lineRule="auto" w:after="60"/>
         <w:ind w:firstLine="420"/>
         <w:jc w:val="both"/>
       </w:pPr>
@@ -392,7 +367,7 @@
     </w:p>
     <w:p>
       <w:pPr>
-        <w:spacing w:line="360" w:lineRule="auto" w:after="80"/>
+        <w:spacing w:line="312" w:lineRule="auto" w:after="60"/>
         <w:ind w:firstLine="420"/>
         <w:jc w:val="both"/>
       </w:pPr>
@@ -420,7 +395,7 @@
     </w:p>
     <w:p>
       <w:pPr>
-        <w:spacing w:line="360" w:lineRule="auto" w:after="80"/>
+        <w:spacing w:line="312" w:lineRule="auto" w:after="60"/>
         <w:ind w:firstLine="420"/>
         <w:jc w:val="both"/>
       </w:pPr>
@@ -435,7 +410,7 @@
     </w:p>
     <w:p>
       <w:pPr>
-        <w:spacing w:line="360" w:lineRule="auto" w:after="80"/>
+        <w:spacing w:line="312" w:lineRule="auto" w:after="60"/>
         <w:ind w:firstLine="420"/>
         <w:jc w:val="both"/>
       </w:pPr>
@@ -450,7 +425,7 @@
     </w:p>
     <w:p>
       <w:pPr>
-        <w:spacing w:line="360" w:lineRule="auto" w:after="80"/>
+        <w:spacing w:line="312" w:lineRule="auto" w:after="60"/>
         <w:ind w:firstLine="420"/>
         <w:jc w:val="both"/>
       </w:pPr>
@@ -465,7 +440,7 @@
     </w:p>
     <w:p>
       <w:pPr>
-        <w:spacing w:line="360" w:lineRule="auto" w:after="80"/>
+        <w:spacing w:line="312" w:lineRule="auto" w:after="60"/>
         <w:ind w:firstLine="420"/>
         <w:jc w:val="both"/>
       </w:pPr>
@@ -480,7 +455,7 @@
     </w:p>
     <w:p>
       <w:pPr>
-        <w:spacing w:line="360" w:lineRule="auto" w:after="80"/>
+        <w:spacing w:line="312" w:lineRule="auto" w:after="60"/>
         <w:ind w:firstLine="420"/>
         <w:jc w:val="both"/>
       </w:pPr>
@@ -505,10 +480,14 @@
         <w:gridCol w:w="4819"/>
       </w:tblGrid>
       <w:tr>
+        <w:trPr>
+          <w:cantSplit/>
+        </w:trPr>
         <w:tc>
           <w:tcPr>
             <w:tcW w:type="dxa" w:w="4819"/>
             <w:shd w:fill="E8EEF7"/>
+            <w:tblHeader/>
           </w:tcPr>
           <w:p>
             <w:pPr>
@@ -529,6 +508,7 @@
           <w:tcPr>
             <w:tcW w:type="dxa" w:w="4819"/>
             <w:shd w:fill="E8EEF7"/>
+            <w:tblHeader/>
           </w:tcPr>
           <w:p>
             <w:pPr>
@@ -547,6 +527,9 @@
         </w:tc>
       </w:tr>
       <w:tr>
+        <w:trPr>
+          <w:cantSplit/>
+        </w:trPr>
         <w:tc>
           <w:tcPr>
             <w:tcW w:type="dxa" w:w="4819"/>
@@ -587,6 +570,9 @@
         </w:tc>
       </w:tr>
       <w:tr>
+        <w:trPr>
+          <w:cantSplit/>
+        </w:trPr>
         <w:tc>
           <w:tcPr>
             <w:tcW w:type="dxa" w:w="4819"/>
@@ -627,6 +613,9 @@
         </w:tc>
       </w:tr>
       <w:tr>
+        <w:trPr>
+          <w:cantSplit/>
+        </w:trPr>
         <w:tc>
           <w:tcPr>
             <w:tcW w:type="dxa" w:w="4819"/>
@@ -667,6 +656,9 @@
         </w:tc>
       </w:tr>
       <w:tr>
+        <w:trPr>
+          <w:cantSplit/>
+        </w:trPr>
         <w:tc>
           <w:tcPr>
             <w:tcW w:type="dxa" w:w="4819"/>
@@ -707,6 +699,9 @@
         </w:tc>
       </w:tr>
       <w:tr>
+        <w:trPr>
+          <w:cantSplit/>
+        </w:trPr>
         <w:tc>
           <w:tcPr>
             <w:tcW w:type="dxa" w:w="4819"/>
@@ -747,6 +742,9 @@
         </w:tc>
       </w:tr>
       <w:tr>
+        <w:trPr>
+          <w:cantSplit/>
+        </w:trPr>
         <w:tc>
           <w:tcPr>
             <w:tcW w:type="dxa" w:w="4819"/>
@@ -807,7 +805,7 @@
     </w:p>
     <w:p>
       <w:pPr>
-        <w:spacing w:line="360" w:lineRule="auto" w:after="80"/>
+        <w:spacing w:line="312" w:lineRule="auto" w:after="60"/>
         <w:ind w:firstLine="420"/>
         <w:jc w:val="both"/>
       </w:pPr>
@@ -822,7 +820,7 @@
     </w:p>
     <w:p>
       <w:pPr>
-        <w:spacing w:line="360" w:lineRule="auto" w:after="80"/>
+        <w:spacing w:line="312" w:lineRule="auto" w:after="60"/>
         <w:ind w:firstLine="420"/>
         <w:jc w:val="both"/>
       </w:pPr>
@@ -837,7 +835,7 @@
     </w:p>
     <w:p>
       <w:pPr>
-        <w:spacing w:line="360" w:lineRule="auto" w:after="80"/>
+        <w:spacing w:line="312" w:lineRule="auto" w:after="60"/>
         <w:ind w:firstLine="420"/>
         <w:jc w:val="both"/>
       </w:pPr>
@@ -865,7 +863,7 @@
     </w:p>
     <w:p>
       <w:pPr>
-        <w:spacing w:line="360" w:lineRule="auto" w:after="80"/>
+        <w:spacing w:line="312" w:lineRule="auto" w:after="60"/>
         <w:ind w:firstLine="420"/>
         <w:jc w:val="both"/>
       </w:pPr>
@@ -893,7 +891,7 @@
     </w:p>
     <w:p>
       <w:pPr>
-        <w:spacing w:line="360" w:lineRule="auto" w:after="80"/>
+        <w:spacing w:line="312" w:lineRule="auto" w:after="60"/>
         <w:ind w:firstLine="420"/>
         <w:jc w:val="both"/>
       </w:pPr>
@@ -921,7 +919,7 @@
     </w:p>
     <w:p>
       <w:pPr>
-        <w:spacing w:line="360" w:lineRule="auto" w:after="80"/>
+        <w:spacing w:line="312" w:lineRule="auto" w:after="60"/>
         <w:ind w:firstLine="420"/>
         <w:jc w:val="both"/>
       </w:pPr>
@@ -936,59 +934,6 @@
     </w:p>
     <w:p>
       <w:pPr>
-        <w:jc w:val="center"/>
-      </w:pPr>
-      <w:r>
-        <w:drawing>
-          <wp:inline xmlns:a="http://schemas.openxmlformats.org/drawingml/2006/main" xmlns:pic="http://schemas.openxmlformats.org/drawingml/2006/picture">
-            <wp:extent cx="3420000" cy="7568465"/>
-            <wp:docPr id="1" name="Picture 1"/>
-            <wp:cNvGraphicFramePr>
-              <a:graphicFrameLocks noChangeAspect="1"/>
-            </wp:cNvGraphicFramePr>
-            <a:graphic>
-              <a:graphicData uri="http://schemas.openxmlformats.org/drawingml/2006/picture">
-                <pic:pic>
-                  <pic:nvPicPr>
-                    <pic:cNvPr id="0" name="phone-shelf.jpg"/>
-                    <pic:cNvPicPr/>
-                  </pic:nvPicPr>
-                  <pic:blipFill>
-                    <a:blip r:embed="rId11"/>
-                    <a:stretch>
-                      <a:fillRect/>
-                    </a:stretch>
-                  </pic:blipFill>
-                  <pic:spPr>
-                    <a:xfrm>
-                      <a:off x="0" y="0"/>
-                      <a:ext cx="3420000" cy="7568465"/>
-                    </a:xfrm>
-                    <a:prstGeom prst="rect"/>
-                  </pic:spPr>
-                </pic:pic>
-              </a:graphicData>
-            </a:graphic>
-          </wp:inline>
-        </w:drawing>
-      </w:r>
-    </w:p>
-    <w:p>
-      <w:pPr>
-        <w:jc w:val="center"/>
-      </w:pPr>
-      <w:r>
-        <w:rPr>
-          <w:rFonts w:ascii="宋体" w:hAnsi="宋体" w:eastAsia="宋体"/>
-          <w:b w:val="0"/>
-          <w:color w:val="666666"/>
-          <w:sz w:val="17"/>
-        </w:rPr>
-        <w:t>图：手机书架与导入入口</w:t>
-      </w:r>
-    </w:p>
-    <w:p>
-      <w:pPr>
         <w:spacing w:before="200" w:after="120"/>
       </w:pPr>
       <w:r>
@@ -1002,7 +947,7 @@
     </w:p>
     <w:p>
       <w:pPr>
-        <w:spacing w:line="360" w:lineRule="auto" w:after="80"/>
+        <w:spacing w:line="312" w:lineRule="auto" w:after="60"/>
         <w:ind w:firstLine="420"/>
         <w:jc w:val="both"/>
       </w:pPr>
@@ -1017,7 +962,7 @@
     </w:p>
     <w:p>
       <w:pPr>
-        <w:spacing w:line="360" w:lineRule="auto" w:after="80"/>
+        <w:spacing w:line="312" w:lineRule="auto" w:after="60"/>
         <w:ind w:firstLine="420"/>
         <w:jc w:val="both"/>
       </w:pPr>
@@ -1032,7 +977,7 @@
     </w:p>
     <w:p>
       <w:pPr>
-        <w:spacing w:line="360" w:lineRule="auto" w:after="80"/>
+        <w:spacing w:line="312" w:lineRule="auto" w:after="60"/>
         <w:ind w:firstLine="420"/>
         <w:jc w:val="both"/>
       </w:pPr>
@@ -1047,7 +992,7 @@
     </w:p>
     <w:p>
       <w:pPr>
-        <w:spacing w:line="360" w:lineRule="auto" w:after="80"/>
+        <w:spacing w:line="312" w:lineRule="auto" w:after="60"/>
         <w:ind w:firstLine="420"/>
         <w:jc w:val="both"/>
       </w:pPr>
@@ -1062,7 +1007,7 @@
     </w:p>
     <w:p>
       <w:pPr>
-        <w:spacing w:line="360" w:lineRule="auto" w:after="80"/>
+        <w:spacing w:line="312" w:lineRule="auto" w:after="60"/>
         <w:ind w:firstLine="420"/>
         <w:jc w:val="both"/>
       </w:pPr>
@@ -1077,7 +1022,7 @@
     </w:p>
     <w:p>
       <w:pPr>
-        <w:spacing w:line="360" w:lineRule="auto" w:after="80"/>
+        <w:spacing w:line="312" w:lineRule="auto" w:after="60"/>
         <w:ind w:firstLine="420"/>
         <w:jc w:val="both"/>
       </w:pPr>
@@ -1092,7 +1037,7 @@
     </w:p>
     <w:p>
       <w:pPr>
-        <w:spacing w:line="360" w:lineRule="auto" w:after="80"/>
+        <w:spacing w:line="312" w:lineRule="auto" w:after="60"/>
         <w:ind w:firstLine="420"/>
         <w:jc w:val="both"/>
       </w:pPr>
@@ -1107,7 +1052,7 @@
     </w:p>
     <w:p>
       <w:pPr>
-        <w:spacing w:line="360" w:lineRule="auto" w:after="80"/>
+        <w:spacing w:line="312" w:lineRule="auto" w:after="60"/>
         <w:ind w:firstLine="420"/>
         <w:jc w:val="both"/>
       </w:pPr>
@@ -1146,10 +1091,14 @@
         <w:gridCol w:w="3213"/>
       </w:tblGrid>
       <w:tr>
+        <w:trPr>
+          <w:cantSplit/>
+        </w:trPr>
         <w:tc>
           <w:tcPr>
             <w:tcW w:type="dxa" w:w="3213"/>
             <w:shd w:fill="E8EEF7"/>
+            <w:tblHeader/>
           </w:tcPr>
           <w:p>
             <w:pPr>
@@ -1170,6 +1119,7 @@
           <w:tcPr>
             <w:tcW w:type="dxa" w:w="3213"/>
             <w:shd w:fill="E8EEF7"/>
+            <w:tblHeader/>
           </w:tcPr>
           <w:p>
             <w:pPr>
@@ -1190,6 +1140,7 @@
           <w:tcPr>
             <w:tcW w:type="dxa" w:w="3213"/>
             <w:shd w:fill="E8EEF7"/>
+            <w:tblHeader/>
           </w:tcPr>
           <w:p>
             <w:pPr>
@@ -1208,6 +1159,9 @@
         </w:tc>
       </w:tr>
       <w:tr>
+        <w:trPr>
+          <w:cantSplit/>
+        </w:trPr>
         <w:tc>
           <w:tcPr>
             <w:tcW w:type="dxa" w:w="3213"/>
@@ -1267,6 +1221,9 @@
         </w:tc>
       </w:tr>
       <w:tr>
+        <w:trPr>
+          <w:cantSplit/>
+        </w:trPr>
         <w:tc>
           <w:tcPr>
             <w:tcW w:type="dxa" w:w="3213"/>
@@ -1326,6 +1283,9 @@
         </w:tc>
       </w:tr>
       <w:tr>
+        <w:trPr>
+          <w:cantSplit/>
+        </w:trPr>
         <w:tc>
           <w:tcPr>
             <w:tcW w:type="dxa" w:w="3213"/>
@@ -1385,6 +1345,9 @@
         </w:tc>
       </w:tr>
       <w:tr>
+        <w:trPr>
+          <w:cantSplit/>
+        </w:trPr>
         <w:tc>
           <w:tcPr>
             <w:tcW w:type="dxa" w:w="3213"/>
@@ -1444,6 +1407,9 @@
         </w:tc>
       </w:tr>
       <w:tr>
+        <w:trPr>
+          <w:cantSplit/>
+        </w:trPr>
         <w:tc>
           <w:tcPr>
             <w:tcW w:type="dxa" w:w="3213"/>
@@ -1503,6 +1469,9 @@
         </w:tc>
       </w:tr>
       <w:tr>
+        <w:trPr>
+          <w:cantSplit/>
+        </w:trPr>
         <w:tc>
           <w:tcPr>
             <w:tcW w:type="dxa" w:w="3213"/>
@@ -1562,6 +1531,9 @@
         </w:tc>
       </w:tr>
       <w:tr>
+        <w:trPr>
+          <w:cantSplit/>
+        </w:trPr>
         <w:tc>
           <w:tcPr>
             <w:tcW w:type="dxa" w:w="3213"/>
@@ -1633,8 +1605,8 @@
       <w:r>
         <w:drawing>
           <wp:inline xmlns:a="http://schemas.openxmlformats.org/drawingml/2006/main" xmlns:pic="http://schemas.openxmlformats.org/drawingml/2006/picture">
-            <wp:extent cx="3168000" cy="2112000"/>
-            <wp:docPr id="2" name="Picture 2"/>
+            <wp:extent cx="3780000" cy="2520000"/>
+            <wp:docPr id="1" name="Picture 1"/>
             <wp:cNvGraphicFramePr>
               <a:graphicFrameLocks noChangeAspect="1"/>
             </wp:cNvGraphicFramePr>
@@ -1646,7 +1618,7 @@
                     <pic:cNvPicPr/>
                   </pic:nvPicPr>
                   <pic:blipFill>
-                    <a:blip r:embed="rId12"/>
+                    <a:blip r:embed="rId11"/>
                     <a:stretch>
                       <a:fillRect/>
                     </a:stretch>
@@ -1654,7 +1626,7 @@
                   <pic:spPr>
                     <a:xfrm>
                       <a:off x="0" y="0"/>
-                      <a:ext cx="3168000" cy="2112000"/>
+                      <a:ext cx="3780000" cy="2520000"/>
                     </a:xfrm>
                     <a:prstGeom prst="rect"/>
                   </pic:spPr>
@@ -1686,8 +1658,8 @@
       <w:r>
         <w:drawing>
           <wp:inline xmlns:a="http://schemas.openxmlformats.org/drawingml/2006/main" xmlns:pic="http://schemas.openxmlformats.org/drawingml/2006/picture">
-            <wp:extent cx="3168000" cy="2112000"/>
-            <wp:docPr id="3" name="Picture 3"/>
+            <wp:extent cx="3780000" cy="2520000"/>
+            <wp:docPr id="2" name="Picture 2"/>
             <wp:cNvGraphicFramePr>
               <a:graphicFrameLocks noChangeAspect="1"/>
             </wp:cNvGraphicFramePr>
@@ -1699,7 +1671,7 @@
                     <pic:cNvPicPr/>
                   </pic:nvPicPr>
                   <pic:blipFill>
-                    <a:blip r:embed="rId13"/>
+                    <a:blip r:embed="rId12"/>
                     <a:stretch>
                       <a:fillRect/>
                     </a:stretch>
@@ -1707,7 +1679,7 @@
                   <pic:spPr>
                     <a:xfrm>
                       <a:off x="0" y="0"/>
-                      <a:ext cx="3168000" cy="2112000"/>
+                      <a:ext cx="3780000" cy="2520000"/>
                     </a:xfrm>
                     <a:prstGeom prst="rect"/>
                   </pic:spPr>
@@ -1747,7 +1719,7 @@
     </w:p>
     <w:p>
       <w:pPr>
-        <w:spacing w:line="360" w:lineRule="auto" w:after="80"/>
+        <w:spacing w:line="312" w:lineRule="auto" w:after="60"/>
         <w:ind w:firstLine="420"/>
         <w:jc w:val="both"/>
       </w:pPr>
@@ -1762,7 +1734,7 @@
     </w:p>
     <w:p>
       <w:pPr>
-        <w:spacing w:line="360" w:lineRule="auto" w:after="80"/>
+        <w:spacing w:line="312" w:lineRule="auto" w:after="60"/>
         <w:ind w:firstLine="420"/>
         <w:jc w:val="both"/>
       </w:pPr>
@@ -1777,7 +1749,7 @@
     </w:p>
     <w:p>
       <w:pPr>
-        <w:spacing w:line="360" w:lineRule="auto" w:after="80"/>
+        <w:spacing w:line="312" w:lineRule="auto" w:after="60"/>
         <w:ind w:firstLine="420"/>
         <w:jc w:val="both"/>
       </w:pPr>
@@ -1792,7 +1764,7 @@
     </w:p>
     <w:p>
       <w:pPr>
-        <w:spacing w:line="360" w:lineRule="auto" w:after="80"/>
+        <w:spacing w:line="312" w:lineRule="auto" w:after="60"/>
         <w:ind w:firstLine="420"/>
         <w:jc w:val="both"/>
       </w:pPr>
@@ -1807,7 +1779,7 @@
     </w:p>
     <w:p>
       <w:pPr>
-        <w:spacing w:line="360" w:lineRule="auto" w:after="80"/>
+        <w:spacing w:line="312" w:lineRule="auto" w:after="60"/>
         <w:ind w:firstLine="420"/>
         <w:jc w:val="both"/>
       </w:pPr>
@@ -1822,7 +1794,7 @@
     </w:p>
     <w:p>
       <w:pPr>
-        <w:spacing w:line="360" w:lineRule="auto" w:after="80"/>
+        <w:spacing w:line="312" w:lineRule="auto" w:after="60"/>
         <w:ind w:firstLine="420"/>
         <w:jc w:val="both"/>
       </w:pPr>
@@ -1850,7 +1822,7 @@
     </w:p>
     <w:p>
       <w:pPr>
-        <w:spacing w:line="360" w:lineRule="auto" w:after="80"/>
+        <w:spacing w:line="312" w:lineRule="auto" w:after="60"/>
         <w:ind w:firstLine="420"/>
         <w:jc w:val="both"/>
       </w:pPr>
@@ -1865,7 +1837,7 @@
     </w:p>
     <w:p>
       <w:pPr>
-        <w:spacing w:line="360" w:lineRule="auto" w:after="80"/>
+        <w:spacing w:line="312" w:lineRule="auto" w:after="60"/>
         <w:ind w:firstLine="420"/>
         <w:jc w:val="both"/>
       </w:pPr>
@@ -1885,8 +1857,8 @@
       <w:r>
         <w:drawing>
           <wp:inline xmlns:a="http://schemas.openxmlformats.org/drawingml/2006/main" xmlns:pic="http://schemas.openxmlformats.org/drawingml/2006/picture">
-            <wp:extent cx="3168000" cy="2112000"/>
-            <wp:docPr id="4" name="Picture 4"/>
+            <wp:extent cx="3780000" cy="2520000"/>
+            <wp:docPr id="3" name="Picture 3"/>
             <wp:cNvGraphicFramePr>
               <a:graphicFrameLocks noChangeAspect="1"/>
             </wp:cNvGraphicFramePr>
@@ -1898,7 +1870,7 @@
                     <pic:cNvPicPr/>
                   </pic:nvPicPr>
                   <pic:blipFill>
-                    <a:blip r:embed="rId14"/>
+                    <a:blip r:embed="rId13"/>
                     <a:stretch>
                       <a:fillRect/>
                     </a:stretch>
@@ -1906,7 +1878,7 @@
                   <pic:spPr>
                     <a:xfrm>
                       <a:off x="0" y="0"/>
-                      <a:ext cx="3168000" cy="2112000"/>
+                      <a:ext cx="3780000" cy="2520000"/>
                     </a:xfrm>
                     <a:prstGeom prst="rect"/>
                   </pic:spPr>
@@ -1946,7 +1918,7 @@
     </w:p>
     <w:p>
       <w:pPr>
-        <w:spacing w:line="360" w:lineRule="auto" w:after="80"/>
+        <w:spacing w:line="312" w:lineRule="auto" w:after="60"/>
         <w:ind w:firstLine="420"/>
         <w:jc w:val="both"/>
       </w:pPr>
@@ -1961,7 +1933,7 @@
     </w:p>
     <w:p>
       <w:pPr>
-        <w:spacing w:line="360" w:lineRule="auto" w:after="80"/>
+        <w:spacing w:line="312" w:lineRule="auto" w:after="60"/>
         <w:ind w:firstLine="420"/>
         <w:jc w:val="both"/>
       </w:pPr>
@@ -1976,7 +1948,7 @@
     </w:p>
     <w:p>
       <w:pPr>
-        <w:spacing w:line="360" w:lineRule="auto" w:after="80"/>
+        <w:spacing w:line="312" w:lineRule="auto" w:after="60"/>
         <w:ind w:firstLine="420"/>
         <w:jc w:val="both"/>
       </w:pPr>
@@ -2015,10 +1987,14 @@
         <w:gridCol w:w="3213"/>
       </w:tblGrid>
       <w:tr>
+        <w:trPr>
+          <w:cantSplit/>
+        </w:trPr>
         <w:tc>
           <w:tcPr>
             <w:tcW w:type="dxa" w:w="3213"/>
             <w:shd w:fill="E8EEF7"/>
+            <w:tblHeader/>
           </w:tcPr>
           <w:p>
             <w:pPr>
@@ -2039,6 +2015,7 @@
           <w:tcPr>
             <w:tcW w:type="dxa" w:w="3213"/>
             <w:shd w:fill="E8EEF7"/>
+            <w:tblHeader/>
           </w:tcPr>
           <w:p>
             <w:pPr>
@@ -2059,6 +2036,7 @@
           <w:tcPr>
             <w:tcW w:type="dxa" w:w="3213"/>
             <w:shd w:fill="E8EEF7"/>
+            <w:tblHeader/>
           </w:tcPr>
           <w:p>
             <w:pPr>
@@ -2077,6 +2055,9 @@
         </w:tc>
       </w:tr>
       <w:tr>
+        <w:trPr>
+          <w:cantSplit/>
+        </w:trPr>
         <w:tc>
           <w:tcPr>
             <w:tcW w:type="dxa" w:w="3213"/>
@@ -2136,6 +2117,9 @@
         </w:tc>
       </w:tr>
       <w:tr>
+        <w:trPr>
+          <w:cantSplit/>
+        </w:trPr>
         <w:tc>
           <w:tcPr>
             <w:tcW w:type="dxa" w:w="3213"/>
@@ -2195,6 +2179,9 @@
         </w:tc>
       </w:tr>
       <w:tr>
+        <w:trPr>
+          <w:cantSplit/>
+        </w:trPr>
         <w:tc>
           <w:tcPr>
             <w:tcW w:type="dxa" w:w="3213"/>
@@ -2261,7 +2248,7 @@
     </w:p>
     <w:p>
       <w:pPr>
-        <w:spacing w:line="360" w:lineRule="auto" w:after="80"/>
+        <w:spacing w:line="312" w:lineRule="auto" w:after="60"/>
         <w:ind w:firstLine="420"/>
         <w:jc w:val="both"/>
       </w:pPr>
@@ -2281,8 +2268,8 @@
       <w:r>
         <w:drawing>
           <wp:inline xmlns:a="http://schemas.openxmlformats.org/drawingml/2006/main" xmlns:pic="http://schemas.openxmlformats.org/drawingml/2006/picture">
-            <wp:extent cx="4680000" cy="3120000"/>
-            <wp:docPr id="5" name="Picture 5"/>
+            <wp:extent cx="3780000" cy="2520000"/>
+            <wp:docPr id="4" name="Picture 4"/>
             <wp:cNvGraphicFramePr>
               <a:graphicFrameLocks noChangeAspect="1"/>
             </wp:cNvGraphicFramePr>
@@ -2294,7 +2281,7 @@
                     <pic:cNvPicPr/>
                   </pic:nvPicPr>
                   <pic:blipFill>
-                    <a:blip r:embed="rId15"/>
+                    <a:blip r:embed="rId14"/>
                     <a:stretch>
                       <a:fillRect/>
                     </a:stretch>
@@ -2302,7 +2289,7 @@
                   <pic:spPr>
                     <a:xfrm>
                       <a:off x="0" y="0"/>
-                      <a:ext cx="4680000" cy="3120000"/>
+                      <a:ext cx="3780000" cy="2520000"/>
                     </a:xfrm>
                     <a:prstGeom prst="rect"/>
                   </pic:spPr>
@@ -2342,7 +2329,7 @@
     </w:p>
     <w:p>
       <w:pPr>
-        <w:spacing w:line="360" w:lineRule="auto" w:after="80"/>
+        <w:spacing w:line="312" w:lineRule="auto" w:after="60"/>
         <w:ind w:firstLine="420"/>
         <w:jc w:val="both"/>
       </w:pPr>
@@ -2357,7 +2344,7 @@
     </w:p>
     <w:p>
       <w:pPr>
-        <w:spacing w:line="360" w:lineRule="auto" w:after="80"/>
+        <w:spacing w:line="312" w:lineRule="auto" w:after="60"/>
         <w:ind w:firstLine="420"/>
         <w:jc w:val="both"/>
       </w:pPr>
@@ -2372,7 +2359,7 @@
     </w:p>
     <w:p>
       <w:pPr>
-        <w:spacing w:line="360" w:lineRule="auto" w:after="80"/>
+        <w:spacing w:line="312" w:lineRule="auto" w:after="60"/>
         <w:ind w:firstLine="420"/>
         <w:jc w:val="both"/>
       </w:pPr>
@@ -2387,7 +2374,7 @@
     </w:p>
     <w:p>
       <w:pPr>
-        <w:spacing w:line="360" w:lineRule="auto" w:after="80"/>
+        <w:spacing w:line="312" w:lineRule="auto" w:after="60"/>
         <w:ind w:firstLine="420"/>
         <w:jc w:val="both"/>
       </w:pPr>
@@ -2426,10 +2413,14 @@
         <w:gridCol w:w="3213"/>
       </w:tblGrid>
       <w:tr>
+        <w:trPr>
+          <w:cantSplit/>
+        </w:trPr>
         <w:tc>
           <w:tcPr>
             <w:tcW w:type="dxa" w:w="3213"/>
             <w:shd w:fill="E8EEF7"/>
+            <w:tblHeader/>
           </w:tcPr>
           <w:p>
             <w:pPr>
@@ -2450,6 +2441,7 @@
           <w:tcPr>
             <w:tcW w:type="dxa" w:w="3213"/>
             <w:shd w:fill="E8EEF7"/>
+            <w:tblHeader/>
           </w:tcPr>
           <w:p>
             <w:pPr>
@@ -2470,6 +2462,7 @@
           <w:tcPr>
             <w:tcW w:type="dxa" w:w="3213"/>
             <w:shd w:fill="E8EEF7"/>
+            <w:tblHeader/>
           </w:tcPr>
           <w:p>
             <w:pPr>
@@ -2488,6 +2481,9 @@
         </w:tc>
       </w:tr>
       <w:tr>
+        <w:trPr>
+          <w:cantSplit/>
+        </w:trPr>
         <w:tc>
           <w:tcPr>
             <w:tcW w:type="dxa" w:w="3213"/>
@@ -2547,6 +2543,9 @@
         </w:tc>
       </w:tr>
       <w:tr>
+        <w:trPr>
+          <w:cantSplit/>
+        </w:trPr>
         <w:tc>
           <w:tcPr>
             <w:tcW w:type="dxa" w:w="3213"/>
@@ -2606,6 +2605,9 @@
         </w:tc>
       </w:tr>
       <w:tr>
+        <w:trPr>
+          <w:cantSplit/>
+        </w:trPr>
         <w:tc>
           <w:tcPr>
             <w:tcW w:type="dxa" w:w="3213"/>
@@ -2665,6 +2667,9 @@
         </w:tc>
       </w:tr>
       <w:tr>
+        <w:trPr>
+          <w:cantSplit/>
+        </w:trPr>
         <w:tc>
           <w:tcPr>
             <w:tcW w:type="dxa" w:w="3213"/>
@@ -2731,7 +2736,7 @@
     </w:p>
     <w:p>
       <w:pPr>
-        <w:spacing w:line="360" w:lineRule="auto" w:after="80"/>
+        <w:spacing w:line="312" w:lineRule="auto" w:after="60"/>
         <w:ind w:firstLine="420"/>
         <w:jc w:val="both"/>
       </w:pPr>
@@ -2746,59 +2751,6 @@
     </w:p>
     <w:p>
       <w:pPr>
-        <w:jc w:val="center"/>
-      </w:pPr>
-      <w:r>
-        <w:drawing>
-          <wp:inline xmlns:a="http://schemas.openxmlformats.org/drawingml/2006/main" xmlns:pic="http://schemas.openxmlformats.org/drawingml/2006/picture">
-            <wp:extent cx="3168000" cy="7010788"/>
-            <wp:docPr id="6" name="Picture 6"/>
-            <wp:cNvGraphicFramePr>
-              <a:graphicFrameLocks noChangeAspect="1"/>
-            </wp:cNvGraphicFramePr>
-            <a:graphic>
-              <a:graphicData uri="http://schemas.openxmlformats.org/drawingml/2006/picture">
-                <pic:pic>
-                  <pic:nvPicPr>
-                    <pic:cNvPr id="0" name="model-manager.jpg"/>
-                    <pic:cNvPicPr/>
-                  </pic:nvPicPr>
-                  <pic:blipFill>
-                    <a:blip r:embed="rId16"/>
-                    <a:stretch>
-                      <a:fillRect/>
-                    </a:stretch>
-                  </pic:blipFill>
-                  <pic:spPr>
-                    <a:xfrm>
-                      <a:off x="0" y="0"/>
-                      <a:ext cx="3168000" cy="7010788"/>
-                    </a:xfrm>
-                    <a:prstGeom prst="rect"/>
-                  </pic:spPr>
-                </pic:pic>
-              </a:graphicData>
-            </a:graphic>
-          </wp:inline>
-        </w:drawing>
-      </w:r>
-    </w:p>
-    <w:p>
-      <w:pPr>
-        <w:jc w:val="center"/>
-      </w:pPr>
-      <w:r>
-        <w:rPr>
-          <w:rFonts w:ascii="宋体" w:hAnsi="宋体" w:eastAsia="宋体"/>
-          <w:b w:val="0"/>
-          <w:color w:val="666666"/>
-          <w:sz w:val="17"/>
-        </w:rPr>
-        <w:t>图：模型管理与存储占用</w:t>
-      </w:r>
-    </w:p>
-    <w:p>
-      <w:pPr>
         <w:spacing w:before="200" w:after="120"/>
       </w:pPr>
       <w:r>
@@ -2812,7 +2764,7 @@
     </w:p>
     <w:p>
       <w:pPr>
-        <w:spacing w:line="360" w:lineRule="auto" w:after="80"/>
+        <w:spacing w:line="312" w:lineRule="auto" w:after="60"/>
         <w:ind w:firstLine="420"/>
         <w:jc w:val="both"/>
       </w:pPr>
@@ -2827,7 +2779,7 @@
     </w:p>
     <w:p>
       <w:pPr>
-        <w:spacing w:line="360" w:lineRule="auto" w:after="80"/>
+        <w:spacing w:line="312" w:lineRule="auto" w:after="60"/>
         <w:ind w:firstLine="420"/>
         <w:jc w:val="both"/>
       </w:pPr>
@@ -2842,7 +2794,7 @@
     </w:p>
     <w:p>
       <w:pPr>
-        <w:spacing w:line="360" w:lineRule="auto" w:after="80"/>
+        <w:spacing w:line="312" w:lineRule="auto" w:after="60"/>
         <w:ind w:firstLine="420"/>
         <w:jc w:val="both"/>
       </w:pPr>
@@ -2857,7 +2809,7 @@
     </w:p>
     <w:p>
       <w:pPr>
-        <w:spacing w:line="360" w:lineRule="auto" w:after="80"/>
+        <w:spacing w:line="312" w:lineRule="auto" w:after="60"/>
         <w:ind w:firstLine="420"/>
         <w:jc w:val="both"/>
       </w:pPr>
@@ -2885,7 +2837,7 @@
     </w:p>
     <w:p>
       <w:pPr>
-        <w:spacing w:line="360" w:lineRule="auto" w:after="80"/>
+        <w:spacing w:line="312" w:lineRule="auto" w:after="60"/>
         <w:ind w:firstLine="420"/>
         <w:jc w:val="both"/>
       </w:pPr>
@@ -2900,7 +2852,7 @@
     </w:p>
     <w:p>
       <w:pPr>
-        <w:spacing w:line="360" w:lineRule="auto" w:after="80"/>
+        <w:spacing w:line="312" w:lineRule="auto" w:after="60"/>
         <w:ind w:firstLine="420"/>
         <w:jc w:val="both"/>
       </w:pPr>
@@ -2928,7 +2880,7 @@
     </w:p>
     <w:p>
       <w:pPr>
-        <w:spacing w:line="360" w:lineRule="auto" w:after="80"/>
+        <w:spacing w:line="312" w:lineRule="auto" w:after="60"/>
         <w:ind w:firstLine="420"/>
         <w:jc w:val="both"/>
       </w:pPr>
@@ -2943,7 +2895,7 @@
     </w:p>
     <w:p>
       <w:pPr>
-        <w:spacing w:line="360" w:lineRule="auto" w:after="80"/>
+        <w:spacing w:line="312" w:lineRule="auto" w:after="60"/>
         <w:ind w:firstLine="420"/>
         <w:jc w:val="both"/>
       </w:pPr>
@@ -2958,7 +2910,7 @@
     </w:p>
     <w:p>
       <w:pPr>
-        <w:spacing w:line="360" w:lineRule="auto" w:after="80"/>
+        <w:spacing w:line="312" w:lineRule="auto" w:after="60"/>
         <w:ind w:firstLine="420"/>
         <w:jc w:val="both"/>
       </w:pPr>
@@ -2973,7 +2925,7 @@
     </w:p>
     <w:p>
       <w:pPr>
-        <w:spacing w:line="360" w:lineRule="auto" w:after="80"/>
+        <w:spacing w:line="312" w:lineRule="auto" w:after="60"/>
         <w:ind w:firstLine="420"/>
         <w:jc w:val="both"/>
       </w:pPr>
@@ -2988,7 +2940,7 @@
     </w:p>
     <w:p>
       <w:pPr>
-        <w:spacing w:line="360" w:lineRule="auto" w:after="80"/>
+        <w:spacing w:line="312" w:lineRule="auto" w:after="60"/>
         <w:ind w:firstLine="420"/>
         <w:jc w:val="both"/>
       </w:pPr>
@@ -3027,10 +2979,14 @@
         <w:gridCol w:w="3213"/>
       </w:tblGrid>
       <w:tr>
+        <w:trPr>
+          <w:cantSplit/>
+        </w:trPr>
         <w:tc>
           <w:tcPr>
             <w:tcW w:type="dxa" w:w="3213"/>
             <w:shd w:fill="E8EEF7"/>
+            <w:tblHeader/>
           </w:tcPr>
           <w:p>
             <w:pPr>
@@ -3051,6 +3007,7 @@
           <w:tcPr>
             <w:tcW w:type="dxa" w:w="3213"/>
             <w:shd w:fill="E8EEF7"/>
+            <w:tblHeader/>
           </w:tcPr>
           <w:p>
             <w:pPr>
@@ -3071,6 +3028,7 @@
           <w:tcPr>
             <w:tcW w:type="dxa" w:w="3213"/>
             <w:shd w:fill="E8EEF7"/>
+            <w:tblHeader/>
           </w:tcPr>
           <w:p>
             <w:pPr>
@@ -3089,6 +3047,9 @@
         </w:tc>
       </w:tr>
       <w:tr>
+        <w:trPr>
+          <w:cantSplit/>
+        </w:trPr>
         <w:tc>
           <w:tcPr>
             <w:tcW w:type="dxa" w:w="3213"/>
@@ -3148,6 +3109,9 @@
         </w:tc>
       </w:tr>
       <w:tr>
+        <w:trPr>
+          <w:cantSplit/>
+        </w:trPr>
         <w:tc>
           <w:tcPr>
             <w:tcW w:type="dxa" w:w="3213"/>
@@ -3207,6 +3171,9 @@
         </w:tc>
       </w:tr>
       <w:tr>
+        <w:trPr>
+          <w:cantSplit/>
+        </w:trPr>
         <w:tc>
           <w:tcPr>
             <w:tcW w:type="dxa" w:w="3213"/>
@@ -3266,6 +3233,9 @@
         </w:tc>
       </w:tr>
       <w:tr>
+        <w:trPr>
+          <w:cantSplit/>
+        </w:trPr>
         <w:tc>
           <w:tcPr>
             <w:tcW w:type="dxa" w:w="3213"/>
@@ -3325,6 +3295,9 @@
         </w:tc>
       </w:tr>
       <w:tr>
+        <w:trPr>
+          <w:cantSplit/>
+        </w:trPr>
         <w:tc>
           <w:tcPr>
             <w:tcW w:type="dxa" w:w="3213"/>
@@ -3404,7 +3377,7 @@
     </w:p>
     <w:p>
       <w:pPr>
-        <w:spacing w:line="360" w:lineRule="auto" w:after="80"/>
+        <w:spacing w:line="312" w:lineRule="auto" w:after="60"/>
         <w:ind w:firstLine="420"/>
         <w:jc w:val="both"/>
       </w:pPr>
@@ -3419,7 +3392,7 @@
     </w:p>
     <w:p>
       <w:pPr>
-        <w:spacing w:line="360" w:lineRule="auto" w:after="80"/>
+        <w:spacing w:line="312" w:lineRule="auto" w:after="60"/>
         <w:ind w:firstLine="420"/>
         <w:jc w:val="both"/>
       </w:pPr>
@@ -3434,7 +3407,7 @@
     </w:p>
     <w:p>
       <w:pPr>
-        <w:spacing w:line="360" w:lineRule="auto" w:after="80"/>
+        <w:spacing w:line="312" w:lineRule="auto" w:after="60"/>
         <w:ind w:firstLine="420"/>
         <w:jc w:val="both"/>
       </w:pPr>
@@ -3449,7 +3422,7 @@
     </w:p>
     <w:p>
       <w:pPr>
-        <w:spacing w:line="360" w:lineRule="auto" w:after="80"/>
+        <w:spacing w:line="312" w:lineRule="auto" w:after="60"/>
         <w:ind w:firstLine="420"/>
         <w:jc w:val="both"/>
       </w:pPr>
@@ -3464,7 +3437,7 @@
     </w:p>
     <w:p>
       <w:pPr>
-        <w:spacing w:line="360" w:lineRule="auto" w:after="80"/>
+        <w:spacing w:line="312" w:lineRule="auto" w:after="60"/>
         <w:ind w:firstLine="420"/>
         <w:jc w:val="both"/>
       </w:pPr>
@@ -3603,7 +3576,7 @@
     </w:p>
     <w:p>
       <w:pPr>
-        <w:spacing w:line="360" w:lineRule="auto" w:after="80"/>
+        <w:spacing w:line="312" w:lineRule="auto" w:after="60"/>
         <w:ind w:firstLine="420"/>
         <w:jc w:val="both"/>
       </w:pPr>
@@ -3631,7 +3604,7 @@
     </w:p>
     <w:p>
       <w:pPr>
-        <w:spacing w:line="360" w:lineRule="auto" w:after="80"/>
+        <w:spacing w:line="312" w:lineRule="auto" w:after="60"/>
         <w:ind w:firstLine="420"/>
         <w:jc w:val="both"/>
       </w:pPr>
@@ -3659,7 +3632,7 @@
     </w:p>
     <w:p>
       <w:pPr>
-        <w:spacing w:line="360" w:lineRule="auto" w:after="80"/>
+        <w:spacing w:line="312" w:lineRule="auto" w:after="60"/>
         <w:ind w:firstLine="420"/>
         <w:jc w:val="both"/>
       </w:pPr>
@@ -3674,7 +3647,7 @@
     </w:p>
     <w:p>
       <w:pPr>
-        <w:spacing w:line="360" w:lineRule="auto" w:after="80"/>
+        <w:spacing w:line="312" w:lineRule="auto" w:after="60"/>
         <w:ind w:firstLine="420"/>
         <w:jc w:val="both"/>
       </w:pPr>
@@ -3689,7 +3662,7 @@
     </w:p>
     <w:p>
       <w:pPr>
-        <w:spacing w:line="360" w:lineRule="auto" w:after="80"/>
+        <w:spacing w:line="312" w:lineRule="auto" w:after="60"/>
         <w:ind w:firstLine="420"/>
         <w:jc w:val="both"/>
       </w:pPr>
@@ -3704,7 +3677,7 @@
     </w:p>
     <w:p>
       <w:pPr>
-        <w:spacing w:line="360" w:lineRule="auto" w:after="80"/>
+        <w:spacing w:line="312" w:lineRule="auto" w:after="60"/>
         <w:ind w:firstLine="420"/>
         <w:jc w:val="both"/>
       </w:pPr>
@@ -3732,7 +3705,7 @@
     </w:p>
     <w:p>
       <w:pPr>
-        <w:spacing w:line="360" w:lineRule="auto" w:after="80"/>
+        <w:spacing w:line="312" w:lineRule="auto" w:after="60"/>
         <w:ind w:firstLine="420"/>
         <w:jc w:val="both"/>
       </w:pPr>
@@ -3747,7 +3720,7 @@
     </w:p>
     <w:p>
       <w:pPr>
-        <w:spacing w:line="360" w:lineRule="auto" w:after="80"/>
+        <w:spacing w:line="312" w:lineRule="auto" w:after="60"/>
         <w:ind w:firstLine="420"/>
         <w:jc w:val="both"/>
       </w:pPr>
@@ -3762,7 +3735,7 @@
     </w:p>
     <w:p>
       <w:pPr>
-        <w:spacing w:line="360" w:lineRule="auto" w:after="80"/>
+        <w:spacing w:line="312" w:lineRule="auto" w:after="60"/>
         <w:ind w:firstLine="420"/>
         <w:jc w:val="both"/>
       </w:pPr>
@@ -3777,7 +3750,7 @@
     </w:p>
     <w:p>
       <w:pPr>
-        <w:spacing w:line="360" w:lineRule="auto" w:after="80"/>
+        <w:spacing w:line="312" w:lineRule="auto" w:after="60"/>
         <w:ind w:firstLine="420"/>
         <w:jc w:val="both"/>
       </w:pPr>
@@ -3805,7 +3778,7 @@
     </w:p>
     <w:p>
       <w:pPr>
-        <w:spacing w:line="360" w:lineRule="auto" w:after="80"/>
+        <w:spacing w:line="312" w:lineRule="auto" w:after="60"/>
         <w:ind w:firstLine="420"/>
         <w:jc w:val="both"/>
       </w:pPr>
@@ -3820,7 +3793,7 @@
     </w:p>
     <w:p>
       <w:pPr>
-        <w:spacing w:line="360" w:lineRule="auto" w:after="80"/>
+        <w:spacing w:line="312" w:lineRule="auto" w:after="60"/>
         <w:ind w:firstLine="420"/>
         <w:jc w:val="both"/>
       </w:pPr>
@@ -3835,7 +3808,7 @@
     </w:p>
     <w:p>
       <w:pPr>
-        <w:spacing w:line="360" w:lineRule="auto" w:after="80"/>
+        <w:spacing w:line="312" w:lineRule="auto" w:after="60"/>
         <w:ind w:firstLine="420"/>
         <w:jc w:val="both"/>
       </w:pPr>
@@ -3863,7 +3836,7 @@
     </w:p>
     <w:p>
       <w:pPr>
-        <w:spacing w:line="360" w:lineRule="auto" w:after="80"/>
+        <w:spacing w:line="312" w:lineRule="auto" w:after="60"/>
         <w:ind w:firstLine="420"/>
         <w:jc w:val="both"/>
       </w:pPr>
@@ -3878,7 +3851,7 @@
     </w:p>
     <w:p>
       <w:pPr>
-        <w:spacing w:line="360" w:lineRule="auto" w:after="80"/>
+        <w:spacing w:line="312" w:lineRule="auto" w:after="60"/>
         <w:ind w:firstLine="420"/>
         <w:jc w:val="both"/>
       </w:pPr>
@@ -3906,7 +3879,7 @@
     </w:p>
     <w:p>
       <w:pPr>
-        <w:spacing w:line="360" w:lineRule="auto" w:after="80"/>
+        <w:spacing w:line="312" w:lineRule="auto" w:after="60"/>
         <w:ind w:firstLine="420"/>
         <w:jc w:val="both"/>
       </w:pPr>
@@ -3921,7 +3894,7 @@
     </w:p>
     <w:p>
       <w:pPr>
-        <w:spacing w:line="360" w:lineRule="auto" w:after="80"/>
+        <w:spacing w:line="312" w:lineRule="auto" w:after="60"/>
         <w:ind w:firstLine="420"/>
         <w:jc w:val="both"/>
       </w:pPr>
@@ -3949,7 +3922,7 @@
     </w:p>
     <w:p>
       <w:pPr>
-        <w:spacing w:line="360" w:lineRule="auto" w:after="80"/>
+        <w:spacing w:line="312" w:lineRule="auto" w:after="60"/>
         <w:ind w:firstLine="420"/>
         <w:jc w:val="both"/>
       </w:pPr>
@@ -3964,7 +3937,7 @@
     </w:p>
     <w:p>
       <w:pPr>
-        <w:spacing w:line="360" w:lineRule="auto" w:after="80"/>
+        <w:spacing w:line="312" w:lineRule="auto" w:after="60"/>
         <w:ind w:firstLine="420"/>
         <w:jc w:val="both"/>
       </w:pPr>
@@ -3992,7 +3965,7 @@
     </w:p>
     <w:p>
       <w:pPr>
-        <w:spacing w:line="360" w:lineRule="auto" w:after="80"/>
+        <w:spacing w:line="312" w:lineRule="auto" w:after="60"/>
         <w:ind w:firstLine="420"/>
         <w:jc w:val="both"/>
       </w:pPr>
@@ -4007,7 +3980,7 @@
     </w:p>
     <w:p>
       <w:pPr>
-        <w:spacing w:line="360" w:lineRule="auto" w:after="80"/>
+        <w:spacing w:line="312" w:lineRule="auto" w:after="60"/>
         <w:ind w:firstLine="420"/>
         <w:jc w:val="both"/>
       </w:pPr>
@@ -4035,7 +4008,7 @@
     </w:p>
     <w:p>
       <w:pPr>
-        <w:spacing w:line="360" w:lineRule="auto" w:after="80"/>
+        <w:spacing w:line="312" w:lineRule="auto" w:after="60"/>
         <w:ind w:firstLine="420"/>
         <w:jc w:val="both"/>
       </w:pPr>
@@ -4050,7 +4023,7 @@
     </w:p>
     <w:p>
       <w:pPr>
-        <w:spacing w:line="360" w:lineRule="auto" w:after="80"/>
+        <w:spacing w:line="312" w:lineRule="auto" w:after="60"/>
         <w:ind w:firstLine="420"/>
         <w:jc w:val="both"/>
       </w:pPr>
@@ -4091,7 +4064,7 @@
     </w:p>
     <w:p>
       <w:pPr>
-        <w:spacing w:line="360" w:lineRule="auto" w:after="80"/>
+        <w:spacing w:line="312" w:lineRule="auto" w:after="60"/>
         <w:ind w:firstLine="420"/>
         <w:jc w:val="both"/>
       </w:pPr>
@@ -4106,7 +4079,7 @@
     </w:p>
     <w:p>
       <w:pPr>
-        <w:spacing w:line="360" w:lineRule="auto" w:after="80"/>
+        <w:spacing w:line="312" w:lineRule="auto" w:after="60"/>
         <w:ind w:firstLine="420"/>
         <w:jc w:val="both"/>
       </w:pPr>
@@ -4134,7 +4107,7 @@
     </w:p>
     <w:p>
       <w:pPr>
-        <w:spacing w:line="360" w:lineRule="auto" w:after="80"/>
+        <w:spacing w:line="312" w:lineRule="auto" w:after="60"/>
         <w:ind w:firstLine="420"/>
         <w:jc w:val="both"/>
       </w:pPr>
@@ -4149,7 +4122,7 @@
     </w:p>
     <w:p>
       <w:pPr>
-        <w:spacing w:line="360" w:lineRule="auto" w:after="80"/>
+        <w:spacing w:line="312" w:lineRule="auto" w:after="60"/>
         <w:ind w:firstLine="420"/>
         <w:jc w:val="both"/>
       </w:pPr>
@@ -4164,7 +4137,7 @@
     </w:p>
     <w:p>
       <w:pPr>
-        <w:spacing w:line="360" w:lineRule="auto" w:after="80"/>
+        <w:spacing w:line="312" w:lineRule="auto" w:after="60"/>
         <w:ind w:firstLine="420"/>
         <w:jc w:val="both"/>
       </w:pPr>
@@ -4179,7 +4152,7 @@
     </w:p>
     <w:p>
       <w:pPr>
-        <w:spacing w:line="360" w:lineRule="auto" w:after="80"/>
+        <w:spacing w:line="312" w:lineRule="auto" w:after="60"/>
         <w:ind w:firstLine="420"/>
         <w:jc w:val="both"/>
       </w:pPr>
@@ -4207,7 +4180,7 @@
     </w:p>
     <w:p>
       <w:pPr>
-        <w:spacing w:line="360" w:lineRule="auto" w:after="80"/>
+        <w:spacing w:line="312" w:lineRule="auto" w:after="60"/>
         <w:ind w:firstLine="420"/>
         <w:jc w:val="both"/>
       </w:pPr>
@@ -4222,7 +4195,7 @@
     </w:p>
     <w:p>
       <w:pPr>
-        <w:spacing w:line="360" w:lineRule="auto" w:after="80"/>
+        <w:spacing w:line="312" w:lineRule="auto" w:after="60"/>
         <w:ind w:firstLine="420"/>
         <w:jc w:val="both"/>
       </w:pPr>
@@ -4237,7 +4210,7 @@
     </w:p>
     <w:p>
       <w:pPr>
-        <w:spacing w:line="360" w:lineRule="auto" w:after="80"/>
+        <w:spacing w:line="312" w:lineRule="auto" w:after="60"/>
         <w:ind w:firstLine="420"/>
         <w:jc w:val="both"/>
       </w:pPr>
@@ -4265,7 +4238,7 @@
     </w:p>
     <w:p>
       <w:pPr>
-        <w:spacing w:line="360" w:lineRule="auto" w:after="80"/>
+        <w:spacing w:line="312" w:lineRule="auto" w:after="60"/>
         <w:ind w:firstLine="420"/>
         <w:jc w:val="both"/>
       </w:pPr>
@@ -4280,7 +4253,7 @@
     </w:p>
     <w:p>
       <w:pPr>
-        <w:spacing w:line="360" w:lineRule="auto" w:after="80"/>
+        <w:spacing w:line="312" w:lineRule="auto" w:after="60"/>
         <w:ind w:firstLine="420"/>
         <w:jc w:val="both"/>
       </w:pPr>
@@ -4295,7 +4268,7 @@
     </w:p>
     <w:p>
       <w:pPr>
-        <w:spacing w:line="360" w:lineRule="auto" w:after="80"/>
+        <w:spacing w:line="312" w:lineRule="auto" w:after="60"/>
         <w:ind w:firstLine="420"/>
         <w:jc w:val="both"/>
       </w:pPr>
@@ -4310,7 +4283,7 @@
     </w:p>
     <w:p>
       <w:pPr>
-        <w:spacing w:line="360" w:lineRule="auto" w:after="80"/>
+        <w:spacing w:line="312" w:lineRule="auto" w:after="60"/>
         <w:ind w:firstLine="420"/>
         <w:jc w:val="both"/>
       </w:pPr>
@@ -4338,7 +4311,7 @@
     </w:p>
     <w:p>
       <w:pPr>
-        <w:spacing w:line="360" w:lineRule="auto" w:after="80"/>
+        <w:spacing w:line="312" w:lineRule="auto" w:after="60"/>
         <w:ind w:firstLine="420"/>
         <w:jc w:val="both"/>
       </w:pPr>
@@ -4353,7 +4326,7 @@
     </w:p>
     <w:p>
       <w:pPr>
-        <w:spacing w:line="360" w:lineRule="auto" w:after="80"/>
+        <w:spacing w:line="312" w:lineRule="auto" w:after="60"/>
         <w:ind w:firstLine="420"/>
         <w:jc w:val="both"/>
       </w:pPr>
@@ -4368,7 +4341,7 @@
     </w:p>
     <w:p>
       <w:pPr>
-        <w:spacing w:line="360" w:lineRule="auto" w:after="80"/>
+        <w:spacing w:line="312" w:lineRule="auto" w:after="60"/>
         <w:ind w:firstLine="420"/>
         <w:jc w:val="both"/>
       </w:pPr>
@@ -4383,7 +4356,7 @@
     </w:p>
     <w:p>
       <w:pPr>
-        <w:spacing w:line="360" w:lineRule="auto" w:after="80"/>
+        <w:spacing w:line="312" w:lineRule="auto" w:after="60"/>
         <w:ind w:firstLine="420"/>
         <w:jc w:val="both"/>
       </w:pPr>
@@ -4411,7 +4384,7 @@
     </w:p>
     <w:p>
       <w:pPr>
-        <w:spacing w:line="360" w:lineRule="auto" w:after="80"/>
+        <w:spacing w:line="312" w:lineRule="auto" w:after="60"/>
         <w:ind w:firstLine="420"/>
         <w:jc w:val="both"/>
       </w:pPr>
@@ -4426,7 +4399,7 @@
     </w:p>
     <w:p>
       <w:pPr>
-        <w:spacing w:line="360" w:lineRule="auto" w:after="80"/>
+        <w:spacing w:line="312" w:lineRule="auto" w:after="60"/>
         <w:ind w:firstLine="420"/>
         <w:jc w:val="both"/>
       </w:pPr>
@@ -4441,7 +4414,7 @@
     </w:p>
     <w:p>
       <w:pPr>
-        <w:spacing w:line="360" w:lineRule="auto" w:after="80"/>
+        <w:spacing w:line="312" w:lineRule="auto" w:after="60"/>
         <w:ind w:firstLine="420"/>
         <w:jc w:val="both"/>
       </w:pPr>

</xml_diff>